<commit_message>
submission of ch1, 2, 3
</commit_message>
<xml_diff>
--- a/references/style.docx
+++ b/references/style.docx
@@ -2683,7 +2683,7 @@
         <w:pStyle w:val="Heading4"/>
       </w:pPr>
       <w:r>
-        <w:t>1. Loading Accounting Area</w:t>
+        <w:t>Loading Accounting Area</w:t>
       </w:r>
     </w:p>
     <w:p>
@@ -2699,229 +2699,229 @@
         <w:rPr>
           <w:rStyle w:val="CommentTok"/>
         </w:rPr>
+        <w:t># Load accounting area shapefile</w:t>
+      </w:r>
+      <w:r>
+        <w:br/>
+      </w:r>
+      <w:r>
+        <w:rPr>
+          <w:rStyle w:val="NormalTok"/>
+        </w:rPr>
+        <w:t xml:space="preserve">accounting_area </w:t>
+      </w:r>
+      <w:r>
+        <w:rPr>
+          <w:rStyle w:val="OtherTok"/>
+        </w:rPr>
+        <w:t>&lt;-</w:t>
+      </w:r>
+      <w:r>
+        <w:rPr>
+          <w:rStyle w:val="NormalTok"/>
+        </w:rPr>
+        <w:t xml:space="preserve"> </w:t>
+      </w:r>
+      <w:r>
+        <w:rPr>
+          <w:rStyle w:val="FunctionTok"/>
+        </w:rPr>
+        <w:t>st_read</w:t>
+      </w:r>
+      <w:r>
+        <w:rPr>
+          <w:rStyle w:val="NormalTok"/>
+        </w:rPr>
+        <w:t xml:space="preserve">(accounting_area_file, </w:t>
+      </w:r>
+      <w:r>
+        <w:rPr>
+          <w:rStyle w:val="AttributeTok"/>
+        </w:rPr>
+        <w:t>quiet =</w:t>
+      </w:r>
+      <w:r>
+        <w:rPr>
+          <w:rStyle w:val="NormalTok"/>
+        </w:rPr>
+        <w:t xml:space="preserve"> </w:t>
+      </w:r>
+      <w:r>
+        <w:rPr>
+          <w:rStyle w:val="ConstantTok"/>
+        </w:rPr>
+        <w:t>TRUE</w:t>
+      </w:r>
+      <w:r>
+        <w:rPr>
+          <w:rStyle w:val="NormalTok"/>
+        </w:rPr>
+        <w:t>)</w:t>
+      </w:r>
+      <w:r>
+        <w:br/>
+      </w:r>
+      <w:r>
+        <w:br/>
+      </w:r>
+      <w:r>
+        <w:rPr>
+          <w:rStyle w:val="CommentTok"/>
+        </w:rPr>
+        <w:t># Display basic information</w:t>
+      </w:r>
+      <w:r>
+        <w:br/>
+      </w:r>
+      <w:r>
+        <w:rPr>
+          <w:rStyle w:val="FunctionTok"/>
+        </w:rPr>
+        <w:t>cat</w:t>
+      </w:r>
+      <w:r>
+        <w:rPr>
+          <w:rStyle w:val="NormalTok"/>
+        </w:rPr>
+        <w:t>(</w:t>
+      </w:r>
+      <w:r>
+        <w:rPr>
+          <w:rStyle w:val="StringTok"/>
+        </w:rPr>
+        <w:t>"Coordinate Reference System:</w:t>
+      </w:r>
+      <w:r>
+        <w:rPr>
+          <w:rStyle w:val="SpecialCharTok"/>
+        </w:rPr>
+        <w:t>\n</w:t>
+      </w:r>
+      <w:r>
+        <w:rPr>
+          <w:rStyle w:val="StringTok"/>
+        </w:rPr>
+        <w:t>"</w:t>
+      </w:r>
+      <w:r>
+        <w:rPr>
+          <w:rStyle w:val="NormalTok"/>
+        </w:rPr>
+        <w:t>)</w:t>
+      </w:r>
+      <w:r>
+        <w:br/>
+      </w:r>
+      <w:r>
+        <w:rPr>
+          <w:rStyle w:val="FunctionTok"/>
+        </w:rPr>
+        <w:t>print</w:t>
+      </w:r>
+      <w:r>
+        <w:rPr>
+          <w:rStyle w:val="NormalTok"/>
+        </w:rPr>
+        <w:t>(</w:t>
+      </w:r>
+      <w:r>
+        <w:rPr>
+          <w:rStyle w:val="FunctionTok"/>
+        </w:rPr>
+        <w:t>st_crs</w:t>
+      </w:r>
+      <w:r>
+        <w:rPr>
+          <w:rStyle w:val="NormalTok"/>
+        </w:rPr>
+        <w:t>(accounting_area))</w:t>
+      </w:r>
+      <w:r>
+        <w:br/>
+      </w:r>
+      <w:r>
+        <w:br/>
+      </w:r>
+      <w:r>
+        <w:rPr>
+          <w:rStyle w:val="FunctionTok"/>
+        </w:rPr>
+        <w:t>cat</w:t>
+      </w:r>
+      <w:r>
+        <w:rPr>
+          <w:rStyle w:val="NormalTok"/>
+        </w:rPr>
+        <w:t>(</w:t>
+      </w:r>
+      <w:r>
+        <w:rPr>
+          <w:rStyle w:val="StringTok"/>
+        </w:rPr>
+        <w:t>"</w:t>
+      </w:r>
+      <w:r>
+        <w:rPr>
+          <w:rStyle w:val="SpecialCharTok"/>
+        </w:rPr>
+        <w:t>\n</w:t>
+      </w:r>
+      <w:r>
+        <w:rPr>
+          <w:rStyle w:val="StringTok"/>
+        </w:rPr>
+        <w:t>Number of features:"</w:t>
+      </w:r>
+      <w:r>
+        <w:rPr>
+          <w:rStyle w:val="NormalTok"/>
+        </w:rPr>
+        <w:t xml:space="preserve">, </w:t>
+      </w:r>
+      <w:r>
+        <w:rPr>
+          <w:rStyle w:val="FunctionTok"/>
+        </w:rPr>
+        <w:t>nrow</w:t>
+      </w:r>
+      <w:r>
+        <w:rPr>
+          <w:rStyle w:val="NormalTok"/>
+        </w:rPr>
+        <w:t xml:space="preserve">(accounting_area), </w:t>
+      </w:r>
+      <w:r>
+        <w:rPr>
+          <w:rStyle w:val="StringTok"/>
+        </w:rPr>
+        <w:t>"</w:t>
+      </w:r>
+      <w:r>
+        <w:rPr>
+          <w:rStyle w:val="SpecialCharTok"/>
+        </w:rPr>
+        <w:t>\n</w:t>
+      </w:r>
+      <w:r>
+        <w:rPr>
+          <w:rStyle w:val="StringTok"/>
+        </w:rPr>
+        <w:t>"</w:t>
+      </w:r>
+      <w:r>
+        <w:rPr>
+          <w:rStyle w:val="NormalTok"/>
+        </w:rPr>
+        <w:t>)</w:t>
+      </w:r>
+      <w:r>
+        <w:br/>
+      </w:r>
+      <w:r>
+        <w:rPr>
+          <w:rStyle w:val="FunctionTok"/>
+        </w:rPr>
         <w:lastRenderedPageBreak/>
-        <w:t># Load accounting area shapefile</w:t>
-      </w:r>
-      <w:r>
-        <w:br/>
-      </w:r>
-      <w:r>
-        <w:rPr>
-          <w:rStyle w:val="NormalTok"/>
-        </w:rPr>
-        <w:t xml:space="preserve">accounting_area </w:t>
-      </w:r>
-      <w:r>
-        <w:rPr>
-          <w:rStyle w:val="OtherTok"/>
-        </w:rPr>
-        <w:t>&lt;-</w:t>
-      </w:r>
-      <w:r>
-        <w:rPr>
-          <w:rStyle w:val="NormalTok"/>
-        </w:rPr>
-        <w:t xml:space="preserve"> </w:t>
-      </w:r>
-      <w:r>
-        <w:rPr>
-          <w:rStyle w:val="FunctionTok"/>
-        </w:rPr>
-        <w:t>st_read</w:t>
-      </w:r>
-      <w:r>
-        <w:rPr>
-          <w:rStyle w:val="NormalTok"/>
-        </w:rPr>
-        <w:t xml:space="preserve">(accounting_area_file, </w:t>
-      </w:r>
-      <w:r>
-        <w:rPr>
-          <w:rStyle w:val="AttributeTok"/>
-        </w:rPr>
-        <w:t>quiet =</w:t>
-      </w:r>
-      <w:r>
-        <w:rPr>
-          <w:rStyle w:val="NormalTok"/>
-        </w:rPr>
-        <w:t xml:space="preserve"> </w:t>
-      </w:r>
-      <w:r>
-        <w:rPr>
-          <w:rStyle w:val="ConstantTok"/>
-        </w:rPr>
-        <w:t>TRUE</w:t>
-      </w:r>
-      <w:r>
-        <w:rPr>
-          <w:rStyle w:val="NormalTok"/>
-        </w:rPr>
-        <w:t>)</w:t>
-      </w:r>
-      <w:r>
-        <w:br/>
-      </w:r>
-      <w:r>
-        <w:br/>
-      </w:r>
-      <w:r>
-        <w:rPr>
-          <w:rStyle w:val="CommentTok"/>
-        </w:rPr>
-        <w:t># Display basic information</w:t>
-      </w:r>
-      <w:r>
-        <w:br/>
-      </w:r>
-      <w:r>
-        <w:rPr>
-          <w:rStyle w:val="FunctionTok"/>
-        </w:rPr>
-        <w:t>cat</w:t>
-      </w:r>
-      <w:r>
-        <w:rPr>
-          <w:rStyle w:val="NormalTok"/>
-        </w:rPr>
-        <w:t>(</w:t>
-      </w:r>
-      <w:r>
-        <w:rPr>
-          <w:rStyle w:val="StringTok"/>
-        </w:rPr>
-        <w:t>"Coordinate Reference System:</w:t>
-      </w:r>
-      <w:r>
-        <w:rPr>
-          <w:rStyle w:val="SpecialCharTok"/>
-        </w:rPr>
-        <w:t>\n</w:t>
-      </w:r>
-      <w:r>
-        <w:rPr>
-          <w:rStyle w:val="StringTok"/>
-        </w:rPr>
-        <w:t>"</w:t>
-      </w:r>
-      <w:r>
-        <w:rPr>
-          <w:rStyle w:val="NormalTok"/>
-        </w:rPr>
-        <w:t>)</w:t>
-      </w:r>
-      <w:r>
-        <w:br/>
-      </w:r>
-      <w:r>
-        <w:rPr>
-          <w:rStyle w:val="FunctionTok"/>
-        </w:rPr>
-        <w:t>print</w:t>
-      </w:r>
-      <w:r>
-        <w:rPr>
-          <w:rStyle w:val="NormalTok"/>
-        </w:rPr>
-        <w:t>(</w:t>
-      </w:r>
-      <w:r>
-        <w:rPr>
-          <w:rStyle w:val="FunctionTok"/>
-        </w:rPr>
-        <w:t>st_crs</w:t>
-      </w:r>
-      <w:r>
-        <w:rPr>
-          <w:rStyle w:val="NormalTok"/>
-        </w:rPr>
-        <w:t>(accounting_area))</w:t>
-      </w:r>
-      <w:r>
-        <w:br/>
-      </w:r>
-      <w:r>
-        <w:br/>
-      </w:r>
-      <w:r>
-        <w:rPr>
-          <w:rStyle w:val="FunctionTok"/>
-        </w:rPr>
-        <w:t>cat</w:t>
-      </w:r>
-      <w:r>
-        <w:rPr>
-          <w:rStyle w:val="NormalTok"/>
-        </w:rPr>
-        <w:t>(</w:t>
-      </w:r>
-      <w:r>
-        <w:rPr>
-          <w:rStyle w:val="StringTok"/>
-        </w:rPr>
-        <w:t>"</w:t>
-      </w:r>
-      <w:r>
-        <w:rPr>
-          <w:rStyle w:val="SpecialCharTok"/>
-        </w:rPr>
-        <w:t>\n</w:t>
-      </w:r>
-      <w:r>
-        <w:rPr>
-          <w:rStyle w:val="StringTok"/>
-        </w:rPr>
-        <w:t>Number of features:"</w:t>
-      </w:r>
-      <w:r>
-        <w:rPr>
-          <w:rStyle w:val="NormalTok"/>
-        </w:rPr>
-        <w:t xml:space="preserve">, </w:t>
-      </w:r>
-      <w:r>
-        <w:rPr>
-          <w:rStyle w:val="FunctionTok"/>
-        </w:rPr>
-        <w:t>nrow</w:t>
-      </w:r>
-      <w:r>
-        <w:rPr>
-          <w:rStyle w:val="NormalTok"/>
-        </w:rPr>
-        <w:t xml:space="preserve">(accounting_area), </w:t>
-      </w:r>
-      <w:r>
-        <w:rPr>
-          <w:rStyle w:val="StringTok"/>
-        </w:rPr>
-        <w:t>"</w:t>
-      </w:r>
-      <w:r>
-        <w:rPr>
-          <w:rStyle w:val="SpecialCharTok"/>
-        </w:rPr>
-        <w:t>\n</w:t>
-      </w:r>
-      <w:r>
-        <w:rPr>
-          <w:rStyle w:val="StringTok"/>
-        </w:rPr>
-        <w:t>"</w:t>
-      </w:r>
-      <w:r>
-        <w:rPr>
-          <w:rStyle w:val="NormalTok"/>
-        </w:rPr>
-        <w:t>)</w:t>
-      </w:r>
-      <w:r>
-        <w:br/>
-      </w:r>
-      <w:r>
-        <w:rPr>
-          <w:rStyle w:val="FunctionTok"/>
-        </w:rPr>
         <w:t>cat</w:t>
       </w:r>
       <w:r>
@@ -4243,531 +4243,531 @@
         <w:rPr>
           <w:rStyle w:val="NormalTok"/>
         </w:rPr>
+        <w:t xml:space="preserve">area_summary </w:t>
+      </w:r>
+      <w:r>
+        <w:rPr>
+          <w:rStyle w:val="OtherTok"/>
+        </w:rPr>
+        <w:t>&lt;-</w:t>
+      </w:r>
+      <w:r>
+        <w:rPr>
+          <w:rStyle w:val="NormalTok"/>
+        </w:rPr>
+        <w:t xml:space="preserve"> </w:t>
+      </w:r>
+      <w:r>
+        <w:rPr>
+          <w:rStyle w:val="FunctionTok"/>
+        </w:rPr>
+        <w:t>data.frame</w:t>
+      </w:r>
+      <w:r>
+        <w:rPr>
+          <w:rStyle w:val="NormalTok"/>
+        </w:rPr>
+        <w:t>(</w:t>
+      </w:r>
+      <w:r>
+        <w:br/>
+      </w:r>
+      <w:r>
+        <w:rPr>
+          <w:rStyle w:val="NormalTok"/>
+        </w:rPr>
+        <w:t xml:space="preserve">  </w:t>
+      </w:r>
+      <w:r>
+        <w:rPr>
+          <w:rStyle w:val="AttributeTok"/>
+        </w:rPr>
+        <w:t>Metric =</w:t>
+      </w:r>
+      <w:r>
+        <w:rPr>
+          <w:rStyle w:val="NormalTok"/>
+        </w:rPr>
+        <w:t xml:space="preserve"> </w:t>
+      </w:r>
+      <w:r>
+        <w:rPr>
+          <w:rStyle w:val="FunctionTok"/>
+        </w:rPr>
+        <w:t>c</w:t>
+      </w:r>
+      <w:r>
+        <w:rPr>
+          <w:rStyle w:val="NormalTok"/>
+        </w:rPr>
+        <w:t>(</w:t>
+      </w:r>
+      <w:r>
+        <w:rPr>
+          <w:rStyle w:val="StringTok"/>
+        </w:rPr>
+        <w:t>"Total Area (hectares)"</w:t>
+      </w:r>
+      <w:r>
+        <w:rPr>
+          <w:rStyle w:val="NormalTok"/>
+        </w:rPr>
+        <w:t xml:space="preserve">, </w:t>
+      </w:r>
+      <w:r>
+        <w:br/>
+      </w:r>
+      <w:r>
+        <w:rPr>
+          <w:rStyle w:val="NormalTok"/>
+        </w:rPr>
+        <w:t xml:space="preserve">             </w:t>
+      </w:r>
+      <w:r>
+        <w:rPr>
+          <w:rStyle w:val="StringTok"/>
+        </w:rPr>
+        <w:t>"Total Area (million hectares)"</w:t>
+      </w:r>
+      <w:r>
+        <w:rPr>
+          <w:rStyle w:val="NormalTok"/>
+        </w:rPr>
+        <w:t>,</w:t>
+      </w:r>
+      <w:r>
+        <w:br/>
+      </w:r>
+      <w:r>
+        <w:rPr>
+          <w:rStyle w:val="NormalTok"/>
+        </w:rPr>
+        <w:t xml:space="preserve">             </w:t>
+      </w:r>
+      <w:r>
+        <w:rPr>
+          <w:rStyle w:val="StringTok"/>
+        </w:rPr>
+        <w:t>"Meets 2.5M ha threshold?"</w:t>
+      </w:r>
+      <w:r>
+        <w:rPr>
+          <w:rStyle w:val="NormalTok"/>
+        </w:rPr>
+        <w:t>),</w:t>
+      </w:r>
+      <w:r>
+        <w:br/>
+      </w:r>
+      <w:r>
+        <w:rPr>
+          <w:rStyle w:val="NormalTok"/>
+        </w:rPr>
+        <w:t xml:space="preserve">  </w:t>
+      </w:r>
+      <w:r>
+        <w:rPr>
+          <w:rStyle w:val="AttributeTok"/>
+        </w:rPr>
+        <w:t>Value =</w:t>
+      </w:r>
+      <w:r>
+        <w:rPr>
+          <w:rStyle w:val="NormalTok"/>
+        </w:rPr>
+        <w:t xml:space="preserve"> </w:t>
+      </w:r>
+      <w:r>
+        <w:rPr>
+          <w:rStyle w:val="FunctionTok"/>
+        </w:rPr>
+        <w:t>c</w:t>
+      </w:r>
+      <w:r>
+        <w:rPr>
+          <w:rStyle w:val="NormalTok"/>
+        </w:rPr>
+        <w:t>(</w:t>
+      </w:r>
+      <w:r>
+        <w:br/>
+      </w:r>
+      <w:r>
+        <w:rPr>
+          <w:rStyle w:val="NormalTok"/>
+        </w:rPr>
+        <w:t xml:space="preserve">    </w:t>
+      </w:r>
+      <w:r>
+        <w:rPr>
+          <w:rStyle w:val="FunctionTok"/>
+        </w:rPr>
+        <w:t>format</w:t>
+      </w:r>
+      <w:r>
+        <w:rPr>
+          <w:rStyle w:val="NormalTok"/>
+        </w:rPr>
+        <w:t>(</w:t>
+      </w:r>
+      <w:r>
+        <w:rPr>
+          <w:rStyle w:val="FunctionTok"/>
+        </w:rPr>
+        <w:t>as.numeric</w:t>
+      </w:r>
+      <w:r>
+        <w:rPr>
+          <w:rStyle w:val="NormalTok"/>
+        </w:rPr>
+        <w:t xml:space="preserve">(total_area_ha), </w:t>
+      </w:r>
+      <w:r>
+        <w:rPr>
+          <w:rStyle w:val="AttributeTok"/>
+        </w:rPr>
+        <w:t>big.mark =</w:t>
+      </w:r>
+      <w:r>
+        <w:rPr>
+          <w:rStyle w:val="NormalTok"/>
+        </w:rPr>
+        <w:t xml:space="preserve"> </w:t>
+      </w:r>
+      <w:r>
+        <w:rPr>
+          <w:rStyle w:val="StringTok"/>
+        </w:rPr>
+        <w:t>","</w:t>
+      </w:r>
+      <w:r>
+        <w:rPr>
+          <w:rStyle w:val="NormalTok"/>
+        </w:rPr>
+        <w:t xml:space="preserve">, </w:t>
+      </w:r>
+      <w:r>
+        <w:rPr>
+          <w:rStyle w:val="AttributeTok"/>
+        </w:rPr>
+        <w:t>scientific =</w:t>
+      </w:r>
+      <w:r>
+        <w:rPr>
+          <w:rStyle w:val="NormalTok"/>
+        </w:rPr>
+        <w:t xml:space="preserve"> </w:t>
+      </w:r>
+      <w:r>
+        <w:rPr>
+          <w:rStyle w:val="ConstantTok"/>
+        </w:rPr>
+        <w:t>FALSE</w:t>
+      </w:r>
+      <w:r>
+        <w:rPr>
+          <w:rStyle w:val="NormalTok"/>
+        </w:rPr>
+        <w:t>),</w:t>
+      </w:r>
+      <w:r>
+        <w:br/>
+      </w:r>
+      <w:r>
+        <w:rPr>
+          <w:rStyle w:val="NormalTok"/>
+        </w:rPr>
+        <w:t xml:space="preserve">    </w:t>
+      </w:r>
+      <w:r>
+        <w:rPr>
+          <w:rStyle w:val="FunctionTok"/>
+        </w:rPr>
+        <w:t>format</w:t>
+      </w:r>
+      <w:r>
+        <w:rPr>
+          <w:rStyle w:val="NormalTok"/>
+        </w:rPr>
+        <w:t xml:space="preserve">(total_area_million_ha, </w:t>
+      </w:r>
+      <w:r>
+        <w:rPr>
+          <w:rStyle w:val="AttributeTok"/>
+        </w:rPr>
+        <w:t>digits =</w:t>
+      </w:r>
+      <w:r>
+        <w:rPr>
+          <w:rStyle w:val="NormalTok"/>
+        </w:rPr>
+        <w:t xml:space="preserve"> </w:t>
+      </w:r>
+      <w:r>
+        <w:rPr>
+          <w:rStyle w:val="DecValTok"/>
+        </w:rPr>
+        <w:t>3</w:t>
+      </w:r>
+      <w:r>
+        <w:rPr>
+          <w:rStyle w:val="NormalTok"/>
+        </w:rPr>
+        <w:t>),</w:t>
+      </w:r>
+      <w:r>
+        <w:br/>
+      </w:r>
+      <w:r>
+        <w:rPr>
+          <w:rStyle w:val="NormalTok"/>
+        </w:rPr>
+        <w:t xml:space="preserve">    </w:t>
+      </w:r>
+      <w:r>
+        <w:rPr>
+          <w:rStyle w:val="FunctionTok"/>
+        </w:rPr>
+        <w:t>ifelse</w:t>
+      </w:r>
+      <w:r>
+        <w:rPr>
+          <w:rStyle w:val="NormalTok"/>
+        </w:rPr>
+        <w:t xml:space="preserve">(total_area_million_ha </w:t>
+      </w:r>
+      <w:r>
+        <w:rPr>
+          <w:rStyle w:val="SpecialCharTok"/>
+        </w:rPr>
+        <w:t>&gt;=</w:t>
+      </w:r>
+      <w:r>
+        <w:rPr>
+          <w:rStyle w:val="NormalTok"/>
+        </w:rPr>
+        <w:t xml:space="preserve"> </w:t>
+      </w:r>
+      <w:r>
+        <w:rPr>
+          <w:rStyle w:val="FloatTok"/>
+        </w:rPr>
+        <w:t>2.5</w:t>
+      </w:r>
+      <w:r>
+        <w:rPr>
+          <w:rStyle w:val="NormalTok"/>
+        </w:rPr>
+        <w:t xml:space="preserve">, </w:t>
+      </w:r>
+      <w:r>
+        <w:rPr>
+          <w:rStyle w:val="StringTok"/>
+        </w:rPr>
+        <w:t>"</w:t>
+      </w:r>
+      <w:r>
+        <w:rPr>
+          <w:rStyle w:val="StringTok"/>
+          <w:rFonts w:ascii="Segoe UI Symbol" w:hAnsi="Segoe UI Symbol" w:cs="Segoe UI Symbol"/>
+        </w:rPr>
+        <w:t>✓</w:t>
+      </w:r>
+      <w:r>
+        <w:rPr>
+          <w:rStyle w:val="StringTok"/>
+        </w:rPr>
+        <w:t xml:space="preserve"> YES"</w:t>
+      </w:r>
+      <w:r>
+        <w:rPr>
+          <w:rStyle w:val="NormalTok"/>
+        </w:rPr>
+        <w:t xml:space="preserve">, </w:t>
+      </w:r>
+      <w:r>
+        <w:rPr>
+          <w:rStyle w:val="StringTok"/>
+        </w:rPr>
+        <w:t>"</w:t>
+      </w:r>
+      <w:r>
+        <w:rPr>
+          <w:rStyle w:val="StringTok"/>
+          <w:rFonts w:ascii="Segoe UI Symbol" w:hAnsi="Segoe UI Symbol" w:cs="Segoe UI Symbol"/>
+        </w:rPr>
+        <w:t>✗</w:t>
+      </w:r>
+      <w:r>
+        <w:rPr>
+          <w:rStyle w:val="StringTok"/>
+        </w:rPr>
+        <w:t xml:space="preserve"> NO"</w:t>
+      </w:r>
+      <w:r>
+        <w:rPr>
+          <w:rStyle w:val="NormalTok"/>
+        </w:rPr>
+        <w:t>)</w:t>
+      </w:r>
+      <w:r>
+        <w:br/>
+      </w:r>
+      <w:r>
+        <w:rPr>
+          <w:rStyle w:val="NormalTok"/>
+        </w:rPr>
+        <w:t xml:space="preserve">  )</w:t>
+      </w:r>
+      <w:r>
+        <w:br/>
+      </w:r>
+      <w:r>
+        <w:rPr>
+          <w:rStyle w:val="NormalTok"/>
+        </w:rPr>
+        <w:t>)</w:t>
+      </w:r>
+      <w:r>
+        <w:br/>
+      </w:r>
+      <w:r>
+        <w:br/>
+      </w:r>
+      <w:r>
+        <w:rPr>
+          <w:rStyle w:val="FunctionTok"/>
+        </w:rPr>
+        <w:t>kable</w:t>
+      </w:r>
+      <w:r>
+        <w:rPr>
+          <w:rStyle w:val="NormalTok"/>
+        </w:rPr>
+        <w:t>(area_summary,</w:t>
+      </w:r>
+      <w:r>
+        <w:br/>
+      </w:r>
+      <w:r>
+        <w:rPr>
+          <w:rStyle w:val="NormalTok"/>
+        </w:rPr>
+        <w:t xml:space="preserve">      </w:t>
+      </w:r>
+      <w:r>
+        <w:rPr>
+          <w:rStyle w:val="AttributeTok"/>
+        </w:rPr>
+        <w:t>caption =</w:t>
+      </w:r>
+      <w:r>
+        <w:rPr>
+          <w:rStyle w:val="NormalTok"/>
+        </w:rPr>
+        <w:t xml:space="preserve"> </w:t>
+      </w:r>
+      <w:r>
+        <w:rPr>
+          <w:rStyle w:val="StringTok"/>
+        </w:rPr>
+        <w:t>"Total Accounting Area - ART TREES Compliance Check"</w:t>
+      </w:r>
+      <w:r>
+        <w:rPr>
+          <w:rStyle w:val="NormalTok"/>
+        </w:rPr>
+        <w:t xml:space="preserve">) </w:t>
+      </w:r>
+      <w:r>
+        <w:rPr>
+          <w:rStyle w:val="SpecialCharTok"/>
+        </w:rPr>
+        <w:t>%&gt;%</w:t>
+      </w:r>
+      <w:r>
+        <w:br/>
+      </w:r>
+      <w:r>
+        <w:rPr>
+          <w:rStyle w:val="NormalTok"/>
+        </w:rPr>
+        <w:t xml:space="preserve">  </w:t>
+      </w:r>
+      <w:r>
+        <w:rPr>
+          <w:rStyle w:val="FunctionTok"/>
+        </w:rPr>
+        <w:t>kable_styling</w:t>
+      </w:r>
+      <w:r>
+        <w:rPr>
+          <w:rStyle w:val="NormalTok"/>
+        </w:rPr>
+        <w:t>(</w:t>
+      </w:r>
+      <w:r>
+        <w:rPr>
+          <w:rStyle w:val="AttributeTok"/>
+        </w:rPr>
+        <w:t>bootstrap_options =</w:t>
+      </w:r>
+      <w:r>
+        <w:rPr>
+          <w:rStyle w:val="NormalTok"/>
+        </w:rPr>
+        <w:t xml:space="preserve"> </w:t>
+      </w:r>
+      <w:r>
+        <w:rPr>
+          <w:rStyle w:val="FunctionTok"/>
+        </w:rPr>
+        <w:t>c</w:t>
+      </w:r>
+      <w:r>
+        <w:rPr>
+          <w:rStyle w:val="NormalTok"/>
+        </w:rPr>
+        <w:t>(</w:t>
+      </w:r>
+      <w:r>
+        <w:rPr>
+          <w:rStyle w:val="StringTok"/>
+        </w:rPr>
+        <w:t>"striped"</w:t>
+      </w:r>
+      <w:r>
+        <w:rPr>
+          <w:rStyle w:val="NormalTok"/>
+        </w:rPr>
+        <w:t xml:space="preserve">, </w:t>
+      </w:r>
+      <w:r>
+        <w:rPr>
+          <w:rStyle w:val="StringTok"/>
+        </w:rPr>
+        <w:t>"hover"</w:t>
+      </w:r>
+      <w:r>
+        <w:rPr>
+          <w:rStyle w:val="NormalTok"/>
+        </w:rPr>
+        <w:t xml:space="preserve">)) </w:t>
+      </w:r>
+      <w:r>
+        <w:rPr>
+          <w:rStyle w:val="SpecialCharTok"/>
+        </w:rPr>
+        <w:t>%&gt;%</w:t>
+      </w:r>
+      <w:r>
+        <w:br/>
+      </w:r>
+      <w:r>
+        <w:rPr>
+          <w:rStyle w:val="NormalTok"/>
+        </w:rPr>
         <w:lastRenderedPageBreak/>
-        <w:t xml:space="preserve">area_summary </w:t>
-      </w:r>
-      <w:r>
-        <w:rPr>
-          <w:rStyle w:val="OtherTok"/>
-        </w:rPr>
-        <w:t>&lt;-</w:t>
-      </w:r>
-      <w:r>
-        <w:rPr>
-          <w:rStyle w:val="NormalTok"/>
-        </w:rPr>
-        <w:t xml:space="preserve"> </w:t>
-      </w:r>
-      <w:r>
-        <w:rPr>
-          <w:rStyle w:val="FunctionTok"/>
-        </w:rPr>
-        <w:t>data.frame</w:t>
-      </w:r>
-      <w:r>
-        <w:rPr>
-          <w:rStyle w:val="NormalTok"/>
-        </w:rPr>
-        <w:t>(</w:t>
-      </w:r>
-      <w:r>
-        <w:br/>
-      </w:r>
-      <w:r>
-        <w:rPr>
-          <w:rStyle w:val="NormalTok"/>
-        </w:rPr>
-        <w:t xml:space="preserve">  </w:t>
-      </w:r>
-      <w:r>
-        <w:rPr>
-          <w:rStyle w:val="AttributeTok"/>
-        </w:rPr>
-        <w:t>Metric =</w:t>
-      </w:r>
-      <w:r>
-        <w:rPr>
-          <w:rStyle w:val="NormalTok"/>
-        </w:rPr>
-        <w:t xml:space="preserve"> </w:t>
-      </w:r>
-      <w:r>
-        <w:rPr>
-          <w:rStyle w:val="FunctionTok"/>
-        </w:rPr>
-        <w:t>c</w:t>
-      </w:r>
-      <w:r>
-        <w:rPr>
-          <w:rStyle w:val="NormalTok"/>
-        </w:rPr>
-        <w:t>(</w:t>
-      </w:r>
-      <w:r>
-        <w:rPr>
-          <w:rStyle w:val="StringTok"/>
-        </w:rPr>
-        <w:t>"Total Area (hectares)"</w:t>
-      </w:r>
-      <w:r>
-        <w:rPr>
-          <w:rStyle w:val="NormalTok"/>
-        </w:rPr>
-        <w:t xml:space="preserve">, </w:t>
-      </w:r>
-      <w:r>
-        <w:br/>
-      </w:r>
-      <w:r>
-        <w:rPr>
-          <w:rStyle w:val="NormalTok"/>
-        </w:rPr>
-        <w:t xml:space="preserve">             </w:t>
-      </w:r>
-      <w:r>
-        <w:rPr>
-          <w:rStyle w:val="StringTok"/>
-        </w:rPr>
-        <w:t>"Total Area (million hectares)"</w:t>
-      </w:r>
-      <w:r>
-        <w:rPr>
-          <w:rStyle w:val="NormalTok"/>
-        </w:rPr>
-        <w:t>,</w:t>
-      </w:r>
-      <w:r>
-        <w:br/>
-      </w:r>
-      <w:r>
-        <w:rPr>
-          <w:rStyle w:val="NormalTok"/>
-        </w:rPr>
-        <w:t xml:space="preserve">             </w:t>
-      </w:r>
-      <w:r>
-        <w:rPr>
-          <w:rStyle w:val="StringTok"/>
-        </w:rPr>
-        <w:t>"Meets 2.5M ha threshold?"</w:t>
-      </w:r>
-      <w:r>
-        <w:rPr>
-          <w:rStyle w:val="NormalTok"/>
-        </w:rPr>
-        <w:t>),</w:t>
-      </w:r>
-      <w:r>
-        <w:br/>
-      </w:r>
-      <w:r>
-        <w:rPr>
-          <w:rStyle w:val="NormalTok"/>
-        </w:rPr>
-        <w:t xml:space="preserve">  </w:t>
-      </w:r>
-      <w:r>
-        <w:rPr>
-          <w:rStyle w:val="AttributeTok"/>
-        </w:rPr>
-        <w:t>Value =</w:t>
-      </w:r>
-      <w:r>
-        <w:rPr>
-          <w:rStyle w:val="NormalTok"/>
-        </w:rPr>
-        <w:t xml:space="preserve"> </w:t>
-      </w:r>
-      <w:r>
-        <w:rPr>
-          <w:rStyle w:val="FunctionTok"/>
-        </w:rPr>
-        <w:t>c</w:t>
-      </w:r>
-      <w:r>
-        <w:rPr>
-          <w:rStyle w:val="NormalTok"/>
-        </w:rPr>
-        <w:t>(</w:t>
-      </w:r>
-      <w:r>
-        <w:br/>
-      </w:r>
-      <w:r>
-        <w:rPr>
-          <w:rStyle w:val="NormalTok"/>
-        </w:rPr>
-        <w:t xml:space="preserve">    </w:t>
-      </w:r>
-      <w:r>
-        <w:rPr>
-          <w:rStyle w:val="FunctionTok"/>
-        </w:rPr>
-        <w:t>format</w:t>
-      </w:r>
-      <w:r>
-        <w:rPr>
-          <w:rStyle w:val="NormalTok"/>
-        </w:rPr>
-        <w:t>(</w:t>
-      </w:r>
-      <w:r>
-        <w:rPr>
-          <w:rStyle w:val="FunctionTok"/>
-        </w:rPr>
-        <w:t>as.numeric</w:t>
-      </w:r>
-      <w:r>
-        <w:rPr>
-          <w:rStyle w:val="NormalTok"/>
-        </w:rPr>
-        <w:t xml:space="preserve">(total_area_ha), </w:t>
-      </w:r>
-      <w:r>
-        <w:rPr>
-          <w:rStyle w:val="AttributeTok"/>
-        </w:rPr>
-        <w:t>big.mark =</w:t>
-      </w:r>
-      <w:r>
-        <w:rPr>
-          <w:rStyle w:val="NormalTok"/>
-        </w:rPr>
-        <w:t xml:space="preserve"> </w:t>
-      </w:r>
-      <w:r>
-        <w:rPr>
-          <w:rStyle w:val="StringTok"/>
-        </w:rPr>
-        <w:t>","</w:t>
-      </w:r>
-      <w:r>
-        <w:rPr>
-          <w:rStyle w:val="NormalTok"/>
-        </w:rPr>
-        <w:t xml:space="preserve">, </w:t>
-      </w:r>
-      <w:r>
-        <w:rPr>
-          <w:rStyle w:val="AttributeTok"/>
-        </w:rPr>
-        <w:t>scientific =</w:t>
-      </w:r>
-      <w:r>
-        <w:rPr>
-          <w:rStyle w:val="NormalTok"/>
-        </w:rPr>
-        <w:t xml:space="preserve"> </w:t>
-      </w:r>
-      <w:r>
-        <w:rPr>
-          <w:rStyle w:val="ConstantTok"/>
-        </w:rPr>
-        <w:t>FALSE</w:t>
-      </w:r>
-      <w:r>
-        <w:rPr>
-          <w:rStyle w:val="NormalTok"/>
-        </w:rPr>
-        <w:t>),</w:t>
-      </w:r>
-      <w:r>
-        <w:br/>
-      </w:r>
-      <w:r>
-        <w:rPr>
-          <w:rStyle w:val="NormalTok"/>
-        </w:rPr>
-        <w:t xml:space="preserve">    </w:t>
-      </w:r>
-      <w:r>
-        <w:rPr>
-          <w:rStyle w:val="FunctionTok"/>
-        </w:rPr>
-        <w:t>format</w:t>
-      </w:r>
-      <w:r>
-        <w:rPr>
-          <w:rStyle w:val="NormalTok"/>
-        </w:rPr>
-        <w:t xml:space="preserve">(total_area_million_ha, </w:t>
-      </w:r>
-      <w:r>
-        <w:rPr>
-          <w:rStyle w:val="AttributeTok"/>
-        </w:rPr>
-        <w:t>digits =</w:t>
-      </w:r>
-      <w:r>
-        <w:rPr>
-          <w:rStyle w:val="NormalTok"/>
-        </w:rPr>
-        <w:t xml:space="preserve"> </w:t>
-      </w:r>
-      <w:r>
-        <w:rPr>
-          <w:rStyle w:val="DecValTok"/>
-        </w:rPr>
-        <w:t>3</w:t>
-      </w:r>
-      <w:r>
-        <w:rPr>
-          <w:rStyle w:val="NormalTok"/>
-        </w:rPr>
-        <w:t>),</w:t>
-      </w:r>
-      <w:r>
-        <w:br/>
-      </w:r>
-      <w:r>
-        <w:rPr>
-          <w:rStyle w:val="NormalTok"/>
-        </w:rPr>
-        <w:t xml:space="preserve">    </w:t>
-      </w:r>
-      <w:r>
-        <w:rPr>
-          <w:rStyle w:val="FunctionTok"/>
-        </w:rPr>
-        <w:t>ifelse</w:t>
-      </w:r>
-      <w:r>
-        <w:rPr>
-          <w:rStyle w:val="NormalTok"/>
-        </w:rPr>
-        <w:t xml:space="preserve">(total_area_million_ha </w:t>
-      </w:r>
-      <w:r>
-        <w:rPr>
-          <w:rStyle w:val="SpecialCharTok"/>
-        </w:rPr>
-        <w:t>&gt;=</w:t>
-      </w:r>
-      <w:r>
-        <w:rPr>
-          <w:rStyle w:val="NormalTok"/>
-        </w:rPr>
-        <w:t xml:space="preserve"> </w:t>
-      </w:r>
-      <w:r>
-        <w:rPr>
-          <w:rStyle w:val="FloatTok"/>
-        </w:rPr>
-        <w:t>2.5</w:t>
-      </w:r>
-      <w:r>
-        <w:rPr>
-          <w:rStyle w:val="NormalTok"/>
-        </w:rPr>
-        <w:t xml:space="preserve">, </w:t>
-      </w:r>
-      <w:r>
-        <w:rPr>
-          <w:rStyle w:val="StringTok"/>
-        </w:rPr>
-        <w:t>"</w:t>
-      </w:r>
-      <w:r>
-        <w:rPr>
-          <w:rStyle w:val="StringTok"/>
-          <w:rFonts w:ascii="Segoe UI Symbol" w:hAnsi="Segoe UI Symbol" w:cs="Segoe UI Symbol"/>
-        </w:rPr>
-        <w:t>✓</w:t>
-      </w:r>
-      <w:r>
-        <w:rPr>
-          <w:rStyle w:val="StringTok"/>
-        </w:rPr>
-        <w:t xml:space="preserve"> YES"</w:t>
-      </w:r>
-      <w:r>
-        <w:rPr>
-          <w:rStyle w:val="NormalTok"/>
-        </w:rPr>
-        <w:t xml:space="preserve">, </w:t>
-      </w:r>
-      <w:r>
-        <w:rPr>
-          <w:rStyle w:val="StringTok"/>
-        </w:rPr>
-        <w:t>"</w:t>
-      </w:r>
-      <w:r>
-        <w:rPr>
-          <w:rStyle w:val="StringTok"/>
-          <w:rFonts w:ascii="Segoe UI Symbol" w:hAnsi="Segoe UI Symbol" w:cs="Segoe UI Symbol"/>
-        </w:rPr>
-        <w:t>✗</w:t>
-      </w:r>
-      <w:r>
-        <w:rPr>
-          <w:rStyle w:val="StringTok"/>
-        </w:rPr>
-        <w:t xml:space="preserve"> NO"</w:t>
-      </w:r>
-      <w:r>
-        <w:rPr>
-          <w:rStyle w:val="NormalTok"/>
-        </w:rPr>
-        <w:t>)</w:t>
-      </w:r>
-      <w:r>
-        <w:br/>
-      </w:r>
-      <w:r>
-        <w:rPr>
-          <w:rStyle w:val="NormalTok"/>
-        </w:rPr>
-        <w:t xml:space="preserve">  )</w:t>
-      </w:r>
-      <w:r>
-        <w:br/>
-      </w:r>
-      <w:r>
-        <w:rPr>
-          <w:rStyle w:val="NormalTok"/>
-        </w:rPr>
-        <w:t>)</w:t>
-      </w:r>
-      <w:r>
-        <w:br/>
-      </w:r>
-      <w:r>
-        <w:br/>
-      </w:r>
-      <w:r>
-        <w:rPr>
-          <w:rStyle w:val="FunctionTok"/>
-        </w:rPr>
-        <w:t>kable</w:t>
-      </w:r>
-      <w:r>
-        <w:rPr>
-          <w:rStyle w:val="NormalTok"/>
-        </w:rPr>
-        <w:t>(area_summary,</w:t>
-      </w:r>
-      <w:r>
-        <w:br/>
-      </w:r>
-      <w:r>
-        <w:rPr>
-          <w:rStyle w:val="NormalTok"/>
-        </w:rPr>
-        <w:t xml:space="preserve">      </w:t>
-      </w:r>
-      <w:r>
-        <w:rPr>
-          <w:rStyle w:val="AttributeTok"/>
-        </w:rPr>
-        <w:t>caption =</w:t>
-      </w:r>
-      <w:r>
-        <w:rPr>
-          <w:rStyle w:val="NormalTok"/>
-        </w:rPr>
-        <w:t xml:space="preserve"> </w:t>
-      </w:r>
-      <w:r>
-        <w:rPr>
-          <w:rStyle w:val="StringTok"/>
-        </w:rPr>
-        <w:t>"Total Accounting Area - ART TREES Compliance Check"</w:t>
-      </w:r>
-      <w:r>
-        <w:rPr>
-          <w:rStyle w:val="NormalTok"/>
-        </w:rPr>
-        <w:t xml:space="preserve">) </w:t>
-      </w:r>
-      <w:r>
-        <w:rPr>
-          <w:rStyle w:val="SpecialCharTok"/>
-        </w:rPr>
-        <w:t>%&gt;%</w:t>
-      </w:r>
-      <w:r>
-        <w:br/>
-      </w:r>
-      <w:r>
-        <w:rPr>
-          <w:rStyle w:val="NormalTok"/>
-        </w:rPr>
-        <w:t xml:space="preserve">  </w:t>
-      </w:r>
-      <w:r>
-        <w:rPr>
-          <w:rStyle w:val="FunctionTok"/>
-        </w:rPr>
-        <w:t>kable_styling</w:t>
-      </w:r>
-      <w:r>
-        <w:rPr>
-          <w:rStyle w:val="NormalTok"/>
-        </w:rPr>
-        <w:t>(</w:t>
-      </w:r>
-      <w:r>
-        <w:rPr>
-          <w:rStyle w:val="AttributeTok"/>
-        </w:rPr>
-        <w:t>bootstrap_options =</w:t>
-      </w:r>
-      <w:r>
-        <w:rPr>
-          <w:rStyle w:val="NormalTok"/>
-        </w:rPr>
-        <w:t xml:space="preserve"> </w:t>
-      </w:r>
-      <w:r>
-        <w:rPr>
-          <w:rStyle w:val="FunctionTok"/>
-        </w:rPr>
-        <w:t>c</w:t>
-      </w:r>
-      <w:r>
-        <w:rPr>
-          <w:rStyle w:val="NormalTok"/>
-        </w:rPr>
-        <w:t>(</w:t>
-      </w:r>
-      <w:r>
-        <w:rPr>
-          <w:rStyle w:val="StringTok"/>
-        </w:rPr>
-        <w:t>"striped"</w:t>
-      </w:r>
-      <w:r>
-        <w:rPr>
-          <w:rStyle w:val="NormalTok"/>
-        </w:rPr>
-        <w:t xml:space="preserve">, </w:t>
-      </w:r>
-      <w:r>
-        <w:rPr>
-          <w:rStyle w:val="StringTok"/>
-        </w:rPr>
-        <w:t>"hover"</w:t>
-      </w:r>
-      <w:r>
-        <w:rPr>
-          <w:rStyle w:val="NormalTok"/>
-        </w:rPr>
-        <w:t xml:space="preserve">)) </w:t>
-      </w:r>
-      <w:r>
-        <w:rPr>
-          <w:rStyle w:val="SpecialCharTok"/>
-        </w:rPr>
-        <w:t>%&gt;%</w:t>
-      </w:r>
-      <w:r>
-        <w:br/>
-      </w:r>
-      <w:r>
-        <w:rPr>
-          <w:rStyle w:val="NormalTok"/>
-        </w:rPr>
         <w:t xml:space="preserve">  </w:t>
       </w:r>
       <w:r>
@@ -6134,860 +6134,860 @@
         <w:rPr>
           <w:rStyle w:val="NormalTok"/>
         </w:rPr>
+        <w:t xml:space="preserve">      </w:t>
+      </w:r>
+      <w:r>
+        <w:rPr>
+          <w:rStyle w:val="FunctionTok"/>
+        </w:rPr>
+        <w:t>row_spec</w:t>
+      </w:r>
+      <w:r>
+        <w:rPr>
+          <w:rStyle w:val="NormalTok"/>
+        </w:rPr>
+        <w:t>(</w:t>
+      </w:r>
+      <w:r>
+        <w:rPr>
+          <w:rStyle w:val="DecValTok"/>
+        </w:rPr>
+        <w:t>0</w:t>
+      </w:r>
+      <w:r>
+        <w:rPr>
+          <w:rStyle w:val="SpecialCharTok"/>
+        </w:rPr>
+        <w:t>:</w:t>
+      </w:r>
+      <w:r>
+        <w:rPr>
+          <w:rStyle w:val="NormalTok"/>
+        </w:rPr>
+        <w:t>(</w:t>
+      </w:r>
+      <w:r>
+        <w:rPr>
+          <w:rStyle w:val="FunctionTok"/>
+        </w:rPr>
+        <w:t>nrow</w:t>
+      </w:r>
+      <w:r>
+        <w:rPr>
+          <w:rStyle w:val="NormalTok"/>
+        </w:rPr>
+        <w:t xml:space="preserve">(overlap_df)), </w:t>
+      </w:r>
+      <w:r>
+        <w:rPr>
+          <w:rStyle w:val="AttributeTok"/>
+        </w:rPr>
+        <w:t>background =</w:t>
+      </w:r>
+      <w:r>
+        <w:rPr>
+          <w:rStyle w:val="NormalTok"/>
+        </w:rPr>
+        <w:t xml:space="preserve"> </w:t>
+      </w:r>
+      <w:r>
+        <w:rPr>
+          <w:rStyle w:val="StringTok"/>
+        </w:rPr>
+        <w:t>"#f0ad4e"</w:t>
+      </w:r>
+      <w:r>
+        <w:rPr>
+          <w:rStyle w:val="NormalTok"/>
+        </w:rPr>
+        <w:t>)</w:t>
+      </w:r>
+      <w:r>
+        <w:br/>
+      </w:r>
+      <w:r>
+        <w:rPr>
+          <w:rStyle w:val="NormalTok"/>
+        </w:rPr>
+        <w:t xml:space="preserve">  } </w:t>
+      </w:r>
+      <w:r>
+        <w:rPr>
+          <w:rStyle w:val="ControlFlowTok"/>
+        </w:rPr>
+        <w:t>else</w:t>
+      </w:r>
+      <w:r>
+        <w:rPr>
+          <w:rStyle w:val="NormalTok"/>
+        </w:rPr>
+        <w:t xml:space="preserve"> {</w:t>
+      </w:r>
+      <w:r>
+        <w:br/>
+      </w:r>
+      <w:r>
+        <w:rPr>
+          <w:rStyle w:val="NormalTok"/>
+        </w:rPr>
+        <w:t xml:space="preserve">    </w:t>
+      </w:r>
+      <w:r>
+        <w:rPr>
+          <w:rStyle w:val="FunctionTok"/>
+        </w:rPr>
+        <w:t>cat</w:t>
+      </w:r>
+      <w:r>
+        <w:rPr>
+          <w:rStyle w:val="NormalTok"/>
+        </w:rPr>
+        <w:t>(</w:t>
+      </w:r>
+      <w:r>
+        <w:rPr>
+          <w:rStyle w:val="StringTok"/>
+        </w:rPr>
+        <w:t>"</w:t>
+      </w:r>
+      <w:r>
+        <w:rPr>
+          <w:rStyle w:val="StringTok"/>
+          <w:rFonts w:ascii="Segoe UI Symbol" w:hAnsi="Segoe UI Symbol" w:cs="Segoe UI Symbol"/>
+        </w:rPr>
+        <w:t>✓</w:t>
+      </w:r>
+      <w:r>
+        <w:rPr>
+          <w:rStyle w:val="StringTok"/>
+        </w:rPr>
+        <w:t xml:space="preserve"> No overlaps detected between features</w:t>
+      </w:r>
+      <w:r>
+        <w:rPr>
+          <w:rStyle w:val="SpecialCharTok"/>
+        </w:rPr>
+        <w:t>\n</w:t>
+      </w:r>
+      <w:r>
+        <w:rPr>
+          <w:rStyle w:val="StringTok"/>
+        </w:rPr>
+        <w:t>"</w:t>
+      </w:r>
+      <w:r>
+        <w:rPr>
+          <w:rStyle w:val="NormalTok"/>
+        </w:rPr>
+        <w:t>)</w:t>
+      </w:r>
+      <w:r>
+        <w:br/>
+      </w:r>
+      <w:r>
+        <w:rPr>
+          <w:rStyle w:val="NormalTok"/>
+        </w:rPr>
+        <w:t xml:space="preserve">  }</w:t>
+      </w:r>
+      <w:r>
+        <w:br/>
+      </w:r>
+      <w:r>
+        <w:rPr>
+          <w:rStyle w:val="NormalTok"/>
+        </w:rPr>
+        <w:t xml:space="preserve">  </w:t>
+      </w:r>
+      <w:r>
+        <w:br/>
+      </w:r>
+      <w:r>
+        <w:rPr>
+          <w:rStyle w:val="NormalTok"/>
+        </w:rPr>
+        <w:t xml:space="preserve">  </w:t>
+      </w:r>
+      <w:r>
+        <w:rPr>
+          <w:rStyle w:val="CommentTok"/>
+        </w:rPr>
+        <w:t># Check for gaps</w:t>
+      </w:r>
+      <w:r>
+        <w:br/>
+      </w:r>
+      <w:r>
+        <w:rPr>
+          <w:rStyle w:val="NormalTok"/>
+        </w:rPr>
+        <w:t xml:space="preserve">  union_geom </w:t>
+      </w:r>
+      <w:r>
+        <w:rPr>
+          <w:rStyle w:val="OtherTok"/>
+        </w:rPr>
+        <w:t>&lt;-</w:t>
+      </w:r>
+      <w:r>
+        <w:rPr>
+          <w:rStyle w:val="NormalTok"/>
+        </w:rPr>
+        <w:t xml:space="preserve"> </w:t>
+      </w:r>
+      <w:r>
+        <w:rPr>
+          <w:rStyle w:val="FunctionTok"/>
+        </w:rPr>
+        <w:t>st_union</w:t>
+      </w:r>
+      <w:r>
+        <w:rPr>
+          <w:rStyle w:val="NormalTok"/>
+        </w:rPr>
+        <w:t>(accounting_area_proj)</w:t>
+      </w:r>
+      <w:r>
+        <w:br/>
+      </w:r>
+      <w:r>
+        <w:rPr>
+          <w:rStyle w:val="NormalTok"/>
+        </w:rPr>
+        <w:t xml:space="preserve">  dissolved_geom </w:t>
+      </w:r>
+      <w:r>
+        <w:rPr>
+          <w:rStyle w:val="OtherTok"/>
+        </w:rPr>
+        <w:t>&lt;-</w:t>
+      </w:r>
+      <w:r>
+        <w:rPr>
+          <w:rStyle w:val="NormalTok"/>
+        </w:rPr>
+        <w:t xml:space="preserve"> </w:t>
+      </w:r>
+      <w:r>
+        <w:rPr>
+          <w:rStyle w:val="FunctionTok"/>
+        </w:rPr>
+        <w:t>st_make_valid</w:t>
+      </w:r>
+      <w:r>
+        <w:rPr>
+          <w:rStyle w:val="NormalTok"/>
+        </w:rPr>
+        <w:t>(</w:t>
+      </w:r>
+      <w:r>
+        <w:rPr>
+          <w:rStyle w:val="FunctionTok"/>
+        </w:rPr>
+        <w:t>st_buffer</w:t>
+      </w:r>
+      <w:r>
+        <w:rPr>
+          <w:rStyle w:val="NormalTok"/>
+        </w:rPr>
+        <w:t xml:space="preserve">(union_geom, </w:t>
+      </w:r>
+      <w:r>
+        <w:rPr>
+          <w:rStyle w:val="AttributeTok"/>
+        </w:rPr>
+        <w:t>dist =</w:t>
+      </w:r>
+      <w:r>
+        <w:rPr>
+          <w:rStyle w:val="NormalTok"/>
+        </w:rPr>
+        <w:t xml:space="preserve"> </w:t>
+      </w:r>
+      <w:r>
+        <w:rPr>
+          <w:rStyle w:val="DecValTok"/>
+        </w:rPr>
+        <w:t>0</w:t>
+      </w:r>
+      <w:r>
+        <w:rPr>
+          <w:rStyle w:val="NormalTok"/>
+        </w:rPr>
+        <w:t>))</w:t>
+      </w:r>
+      <w:r>
+        <w:br/>
+      </w:r>
+      <w:r>
+        <w:rPr>
+          <w:rStyle w:val="NormalTok"/>
+        </w:rPr>
+        <w:t xml:space="preserve">  </w:t>
+      </w:r>
+      <w:r>
+        <w:br/>
+      </w:r>
+      <w:r>
+        <w:rPr>
+          <w:rStyle w:val="NormalTok"/>
+        </w:rPr>
+        <w:t xml:space="preserve">  </w:t>
+      </w:r>
+      <w:r>
+        <w:rPr>
+          <w:rStyle w:val="CommentTok"/>
+        </w:rPr>
+        <w:t># Area comparison to detect potential gaps</w:t>
+      </w:r>
+      <w:r>
+        <w:br/>
+      </w:r>
+      <w:r>
+        <w:rPr>
+          <w:rStyle w:val="NormalTok"/>
+        </w:rPr>
+        <w:t xml:space="preserve">  union_area </w:t>
+      </w:r>
+      <w:r>
+        <w:rPr>
+          <w:rStyle w:val="OtherTok"/>
+        </w:rPr>
+        <w:t>&lt;-</w:t>
+      </w:r>
+      <w:r>
+        <w:rPr>
+          <w:rStyle w:val="NormalTok"/>
+        </w:rPr>
+        <w:t xml:space="preserve"> </w:t>
+      </w:r>
+      <w:r>
+        <w:rPr>
+          <w:rStyle w:val="FunctionTok"/>
+        </w:rPr>
+        <w:t>st_area</w:t>
+      </w:r>
+      <w:r>
+        <w:rPr>
+          <w:rStyle w:val="NormalTok"/>
+        </w:rPr>
+        <w:t>(union_geom)</w:t>
+      </w:r>
+      <w:r>
+        <w:br/>
+      </w:r>
+      <w:r>
+        <w:rPr>
+          <w:rStyle w:val="NormalTok"/>
+        </w:rPr>
+        <w:t xml:space="preserve">  dissolved_area </w:t>
+      </w:r>
+      <w:r>
+        <w:rPr>
+          <w:rStyle w:val="OtherTok"/>
+        </w:rPr>
+        <w:t>&lt;-</w:t>
+      </w:r>
+      <w:r>
+        <w:rPr>
+          <w:rStyle w:val="NormalTok"/>
+        </w:rPr>
+        <w:t xml:space="preserve"> </w:t>
+      </w:r>
+      <w:r>
+        <w:rPr>
+          <w:rStyle w:val="FunctionTok"/>
+        </w:rPr>
+        <w:t>st_area</w:t>
+      </w:r>
+      <w:r>
+        <w:rPr>
+          <w:rStyle w:val="NormalTok"/>
+        </w:rPr>
+        <w:t>(dissolved_geom)</w:t>
+      </w:r>
+      <w:r>
+        <w:br/>
+      </w:r>
+      <w:r>
+        <w:rPr>
+          <w:rStyle w:val="NormalTok"/>
+        </w:rPr>
+        <w:t xml:space="preserve">  area_diff_pct </w:t>
+      </w:r>
+      <w:r>
+        <w:rPr>
+          <w:rStyle w:val="OtherTok"/>
+        </w:rPr>
+        <w:t>&lt;-</w:t>
+      </w:r>
+      <w:r>
+        <w:rPr>
+          <w:rStyle w:val="NormalTok"/>
+        </w:rPr>
+        <w:t xml:space="preserve"> </w:t>
+      </w:r>
+      <w:r>
+        <w:rPr>
+          <w:rStyle w:val="FunctionTok"/>
+        </w:rPr>
+        <w:t>abs</w:t>
+      </w:r>
+      <w:r>
+        <w:rPr>
+          <w:rStyle w:val="NormalTok"/>
+        </w:rPr>
+        <w:t>(</w:t>
+      </w:r>
+      <w:r>
+        <w:rPr>
+          <w:rStyle w:val="FunctionTok"/>
+        </w:rPr>
+        <w:t>as.numeric</w:t>
+      </w:r>
+      <w:r>
+        <w:rPr>
+          <w:rStyle w:val="NormalTok"/>
+        </w:rPr>
+        <w:t xml:space="preserve">(union_area </w:t>
+      </w:r>
+      <w:r>
+        <w:rPr>
+          <w:rStyle w:val="SpecialCharTok"/>
+        </w:rPr>
+        <w:t>-</w:t>
+      </w:r>
+      <w:r>
+        <w:rPr>
+          <w:rStyle w:val="NormalTok"/>
+        </w:rPr>
+        <w:t xml:space="preserve"> dissolved_area) </w:t>
+      </w:r>
+      <w:r>
+        <w:rPr>
+          <w:rStyle w:val="SpecialCharTok"/>
+        </w:rPr>
+        <w:t>/</w:t>
+      </w:r>
+      <w:r>
+        <w:rPr>
+          <w:rStyle w:val="NormalTok"/>
+        </w:rPr>
+        <w:t xml:space="preserve"> </w:t>
+      </w:r>
+      <w:r>
+        <w:rPr>
+          <w:rStyle w:val="FunctionTok"/>
+        </w:rPr>
+        <w:t>as.numeric</w:t>
+      </w:r>
+      <w:r>
+        <w:rPr>
+          <w:rStyle w:val="NormalTok"/>
+        </w:rPr>
+        <w:t xml:space="preserve">(union_area) </w:t>
+      </w:r>
+      <w:r>
+        <w:rPr>
+          <w:rStyle w:val="SpecialCharTok"/>
+        </w:rPr>
+        <w:t>*</w:t>
+      </w:r>
+      <w:r>
+        <w:rPr>
+          <w:rStyle w:val="NormalTok"/>
+        </w:rPr>
+        <w:t xml:space="preserve"> </w:t>
+      </w:r>
+      <w:r>
+        <w:rPr>
+          <w:rStyle w:val="DecValTok"/>
+        </w:rPr>
+        <w:t>100</w:t>
+      </w:r>
+      <w:r>
+        <w:rPr>
+          <w:rStyle w:val="NormalTok"/>
+        </w:rPr>
+        <w:t>)</w:t>
+      </w:r>
+      <w:r>
+        <w:br/>
+      </w:r>
+      <w:r>
+        <w:rPr>
+          <w:rStyle w:val="NormalTok"/>
+        </w:rPr>
+        <w:t xml:space="preserve">  </w:t>
+      </w:r>
+      <w:r>
+        <w:br/>
+      </w:r>
+      <w:r>
+        <w:rPr>
+          <w:rStyle w:val="NormalTok"/>
+        </w:rPr>
+        <w:t xml:space="preserve">  </w:t>
+      </w:r>
+      <w:r>
+        <w:rPr>
+          <w:rStyle w:val="FunctionTok"/>
+        </w:rPr>
+        <w:t>cat</w:t>
+      </w:r>
+      <w:r>
+        <w:rPr>
+          <w:rStyle w:val="NormalTok"/>
+        </w:rPr>
+        <w:t>(</w:t>
+      </w:r>
+      <w:r>
+        <w:rPr>
+          <w:rStyle w:val="StringTok"/>
+        </w:rPr>
+        <w:t>"</w:t>
+      </w:r>
+      <w:r>
+        <w:rPr>
+          <w:rStyle w:val="SpecialCharTok"/>
+        </w:rPr>
+        <w:t>\n</w:t>
+      </w:r>
+      <w:r>
+        <w:rPr>
+          <w:rStyle w:val="StringTok"/>
+        </w:rPr>
+        <w:t>Gap Analysis:</w:t>
+      </w:r>
+      <w:r>
+        <w:rPr>
+          <w:rStyle w:val="SpecialCharTok"/>
+        </w:rPr>
+        <w:t>\n</w:t>
+      </w:r>
+      <w:r>
+        <w:rPr>
+          <w:rStyle w:val="StringTok"/>
+        </w:rPr>
+        <w:t>"</w:t>
+      </w:r>
+      <w:r>
+        <w:rPr>
+          <w:rStyle w:val="NormalTok"/>
+        </w:rPr>
+        <w:t>)</w:t>
+      </w:r>
+      <w:r>
+        <w:br/>
+      </w:r>
+      <w:r>
+        <w:rPr>
+          <w:rStyle w:val="NormalTok"/>
+        </w:rPr>
+        <w:t xml:space="preserve">  </w:t>
+      </w:r>
+      <w:r>
+        <w:rPr>
+          <w:rStyle w:val="FunctionTok"/>
+        </w:rPr>
+        <w:t>cat</w:t>
+      </w:r>
+      <w:r>
+        <w:rPr>
+          <w:rStyle w:val="NormalTok"/>
+        </w:rPr>
+        <w:t>(</w:t>
+      </w:r>
+      <w:r>
+        <w:rPr>
+          <w:rStyle w:val="StringTok"/>
+        </w:rPr>
+        <w:t>"Union area:"</w:t>
+      </w:r>
+      <w:r>
+        <w:rPr>
+          <w:rStyle w:val="NormalTok"/>
+        </w:rPr>
+        <w:t xml:space="preserve">, </w:t>
+      </w:r>
+      <w:r>
+        <w:rPr>
+          <w:rStyle w:val="FunctionTok"/>
+        </w:rPr>
+        <w:t>format</w:t>
+      </w:r>
+      <w:r>
+        <w:rPr>
+          <w:rStyle w:val="NormalTok"/>
+        </w:rPr>
+        <w:t>(</w:t>
+      </w:r>
+      <w:r>
+        <w:rPr>
+          <w:rStyle w:val="FunctionTok"/>
+        </w:rPr>
+        <w:t>as.numeric</w:t>
+      </w:r>
+      <w:r>
+        <w:rPr>
+          <w:rStyle w:val="NormalTok"/>
+        </w:rPr>
+        <w:t xml:space="preserve">(union_area), </w:t>
+      </w:r>
+      <w:r>
+        <w:rPr>
+          <w:rStyle w:val="AttributeTok"/>
+        </w:rPr>
+        <w:t>scientific =</w:t>
+      </w:r>
+      <w:r>
+        <w:rPr>
+          <w:rStyle w:val="NormalTok"/>
+        </w:rPr>
+        <w:t xml:space="preserve"> </w:t>
+      </w:r>
+      <w:r>
+        <w:rPr>
+          <w:rStyle w:val="ConstantTok"/>
+        </w:rPr>
+        <w:t>FALSE</w:t>
+      </w:r>
+      <w:r>
+        <w:rPr>
+          <w:rStyle w:val="NormalTok"/>
+        </w:rPr>
+        <w:t xml:space="preserve">), </w:t>
+      </w:r>
+      <w:r>
+        <w:rPr>
+          <w:rStyle w:val="StringTok"/>
+        </w:rPr>
+        <w:t>"m²</w:t>
+      </w:r>
+      <w:r>
+        <w:rPr>
+          <w:rStyle w:val="SpecialCharTok"/>
+        </w:rPr>
+        <w:t>\n</w:t>
+      </w:r>
+      <w:r>
+        <w:rPr>
+          <w:rStyle w:val="StringTok"/>
+        </w:rPr>
+        <w:t>"</w:t>
+      </w:r>
+      <w:r>
+        <w:rPr>
+          <w:rStyle w:val="NormalTok"/>
+        </w:rPr>
+        <w:t>)</w:t>
+      </w:r>
+      <w:r>
+        <w:br/>
+      </w:r>
+      <w:r>
+        <w:rPr>
+          <w:rStyle w:val="NormalTok"/>
+        </w:rPr>
+        <w:t xml:space="preserve">  </w:t>
+      </w:r>
+      <w:r>
+        <w:rPr>
+          <w:rStyle w:val="FunctionTok"/>
+        </w:rPr>
+        <w:t>cat</w:t>
+      </w:r>
+      <w:r>
+        <w:rPr>
+          <w:rStyle w:val="NormalTok"/>
+        </w:rPr>
+        <w:t>(</w:t>
+      </w:r>
+      <w:r>
+        <w:rPr>
+          <w:rStyle w:val="StringTok"/>
+        </w:rPr>
+        <w:t>"Dissolved area:"</w:t>
+      </w:r>
+      <w:r>
+        <w:rPr>
+          <w:rStyle w:val="NormalTok"/>
+        </w:rPr>
+        <w:t xml:space="preserve">, </w:t>
+      </w:r>
+      <w:r>
+        <w:rPr>
+          <w:rStyle w:val="FunctionTok"/>
+        </w:rPr>
+        <w:t>format</w:t>
+      </w:r>
+      <w:r>
+        <w:rPr>
+          <w:rStyle w:val="NormalTok"/>
+        </w:rPr>
+        <w:t>(</w:t>
+      </w:r>
+      <w:r>
+        <w:rPr>
+          <w:rStyle w:val="FunctionTok"/>
+        </w:rPr>
+        <w:t>as.numeric</w:t>
+      </w:r>
+      <w:r>
+        <w:rPr>
+          <w:rStyle w:val="NormalTok"/>
+        </w:rPr>
+        <w:t xml:space="preserve">(dissolved_area), </w:t>
+      </w:r>
+      <w:r>
+        <w:rPr>
+          <w:rStyle w:val="AttributeTok"/>
+        </w:rPr>
+        <w:t>scientific =</w:t>
+      </w:r>
+      <w:r>
+        <w:rPr>
+          <w:rStyle w:val="NormalTok"/>
+        </w:rPr>
+        <w:t xml:space="preserve"> </w:t>
+      </w:r>
+      <w:r>
+        <w:rPr>
+          <w:rStyle w:val="ConstantTok"/>
+        </w:rPr>
+        <w:t>FALSE</w:t>
+      </w:r>
+      <w:r>
+        <w:rPr>
+          <w:rStyle w:val="NormalTok"/>
+        </w:rPr>
+        <w:t xml:space="preserve">), </w:t>
+      </w:r>
+      <w:r>
+        <w:rPr>
+          <w:rStyle w:val="StringTok"/>
+        </w:rPr>
+        <w:t>"m²</w:t>
+      </w:r>
+      <w:r>
+        <w:rPr>
+          <w:rStyle w:val="SpecialCharTok"/>
+        </w:rPr>
+        <w:t>\n</w:t>
+      </w:r>
+      <w:r>
+        <w:rPr>
+          <w:rStyle w:val="StringTok"/>
+        </w:rPr>
+        <w:t>"</w:t>
+      </w:r>
+      <w:r>
+        <w:rPr>
+          <w:rStyle w:val="NormalTok"/>
+        </w:rPr>
+        <w:t>)</w:t>
+      </w:r>
+      <w:r>
+        <w:br/>
+      </w:r>
+      <w:r>
+        <w:rPr>
+          <w:rStyle w:val="NormalTok"/>
+        </w:rPr>
+        <w:t xml:space="preserve">  </w:t>
+      </w:r>
+      <w:r>
+        <w:rPr>
+          <w:rStyle w:val="FunctionTok"/>
+        </w:rPr>
+        <w:t>cat</w:t>
+      </w:r>
+      <w:r>
+        <w:rPr>
+          <w:rStyle w:val="NormalTok"/>
+        </w:rPr>
+        <w:t>(</w:t>
+      </w:r>
+      <w:r>
+        <w:rPr>
+          <w:rStyle w:val="StringTok"/>
+        </w:rPr>
+        <w:t>"Difference:"</w:t>
+      </w:r>
+      <w:r>
+        <w:rPr>
+          <w:rStyle w:val="NormalTok"/>
+        </w:rPr>
+        <w:t xml:space="preserve">, </w:t>
+      </w:r>
+      <w:r>
+        <w:rPr>
+          <w:rStyle w:val="FunctionTok"/>
+        </w:rPr>
+        <w:t>format</w:t>
+      </w:r>
+      <w:r>
+        <w:rPr>
+          <w:rStyle w:val="NormalTok"/>
+        </w:rPr>
+        <w:t xml:space="preserve">(area_diff_pct, </w:t>
+      </w:r>
+      <w:r>
+        <w:rPr>
+          <w:rStyle w:val="AttributeTok"/>
+        </w:rPr>
+        <w:t>digits =</w:t>
+      </w:r>
+      <w:r>
+        <w:rPr>
+          <w:rStyle w:val="NormalTok"/>
+        </w:rPr>
+        <w:t xml:space="preserve"> </w:t>
+      </w:r>
+      <w:r>
+        <w:rPr>
+          <w:rStyle w:val="DecValTok"/>
+        </w:rPr>
+        <w:t>4</w:t>
+      </w:r>
+      <w:r>
+        <w:rPr>
+          <w:rStyle w:val="NormalTok"/>
+        </w:rPr>
+        <w:t xml:space="preserve">), </w:t>
+      </w:r>
+      <w:r>
+        <w:rPr>
+          <w:rStyle w:val="StringTok"/>
+        </w:rPr>
+        <w:t>"%</w:t>
+      </w:r>
+      <w:r>
+        <w:rPr>
+          <w:rStyle w:val="SpecialCharTok"/>
+        </w:rPr>
+        <w:t>\n</w:t>
+      </w:r>
+      <w:r>
+        <w:rPr>
+          <w:rStyle w:val="StringTok"/>
+        </w:rPr>
+        <w:t>"</w:t>
+      </w:r>
+      <w:r>
+        <w:rPr>
+          <w:rStyle w:val="NormalTok"/>
+        </w:rPr>
+        <w:t>)</w:t>
+      </w:r>
+      <w:r>
+        <w:br/>
+      </w:r>
+      <w:r>
+        <w:rPr>
+          <w:rStyle w:val="NormalTok"/>
+        </w:rPr>
         <w:lastRenderedPageBreak/>
-        <w:t xml:space="preserve">      </w:t>
-      </w:r>
-      <w:r>
-        <w:rPr>
-          <w:rStyle w:val="FunctionTok"/>
-        </w:rPr>
-        <w:t>row_spec</w:t>
-      </w:r>
-      <w:r>
-        <w:rPr>
-          <w:rStyle w:val="NormalTok"/>
-        </w:rPr>
-        <w:t>(</w:t>
-      </w:r>
-      <w:r>
-        <w:rPr>
-          <w:rStyle w:val="DecValTok"/>
-        </w:rPr>
-        <w:t>0</w:t>
-      </w:r>
-      <w:r>
-        <w:rPr>
-          <w:rStyle w:val="SpecialCharTok"/>
-        </w:rPr>
-        <w:t>:</w:t>
-      </w:r>
-      <w:r>
-        <w:rPr>
-          <w:rStyle w:val="NormalTok"/>
-        </w:rPr>
-        <w:t>(</w:t>
-      </w:r>
-      <w:r>
-        <w:rPr>
-          <w:rStyle w:val="FunctionTok"/>
-        </w:rPr>
-        <w:t>nrow</w:t>
-      </w:r>
-      <w:r>
-        <w:rPr>
-          <w:rStyle w:val="NormalTok"/>
-        </w:rPr>
-        <w:t xml:space="preserve">(overlap_df)), </w:t>
-      </w:r>
-      <w:r>
-        <w:rPr>
-          <w:rStyle w:val="AttributeTok"/>
-        </w:rPr>
-        <w:t>background =</w:t>
-      </w:r>
-      <w:r>
-        <w:rPr>
-          <w:rStyle w:val="NormalTok"/>
-        </w:rPr>
-        <w:t xml:space="preserve"> </w:t>
-      </w:r>
-      <w:r>
-        <w:rPr>
-          <w:rStyle w:val="StringTok"/>
-        </w:rPr>
-        <w:t>"#f0ad4e"</w:t>
-      </w:r>
-      <w:r>
-        <w:rPr>
-          <w:rStyle w:val="NormalTok"/>
-        </w:rPr>
-        <w:t>)</w:t>
-      </w:r>
-      <w:r>
-        <w:br/>
-      </w:r>
-      <w:r>
-        <w:rPr>
-          <w:rStyle w:val="NormalTok"/>
-        </w:rPr>
-        <w:t xml:space="preserve">  } </w:t>
-      </w:r>
-      <w:r>
-        <w:rPr>
-          <w:rStyle w:val="ControlFlowTok"/>
-        </w:rPr>
-        <w:t>else</w:t>
-      </w:r>
-      <w:r>
-        <w:rPr>
-          <w:rStyle w:val="NormalTok"/>
-        </w:rPr>
-        <w:t xml:space="preserve"> {</w:t>
-      </w:r>
-      <w:r>
-        <w:br/>
-      </w:r>
-      <w:r>
-        <w:rPr>
-          <w:rStyle w:val="NormalTok"/>
-        </w:rPr>
-        <w:t xml:space="preserve">    </w:t>
-      </w:r>
-      <w:r>
-        <w:rPr>
-          <w:rStyle w:val="FunctionTok"/>
-        </w:rPr>
-        <w:t>cat</w:t>
-      </w:r>
-      <w:r>
-        <w:rPr>
-          <w:rStyle w:val="NormalTok"/>
-        </w:rPr>
-        <w:t>(</w:t>
-      </w:r>
-      <w:r>
-        <w:rPr>
-          <w:rStyle w:val="StringTok"/>
-        </w:rPr>
-        <w:t>"</w:t>
-      </w:r>
-      <w:r>
-        <w:rPr>
-          <w:rStyle w:val="StringTok"/>
-          <w:rFonts w:ascii="Segoe UI Symbol" w:hAnsi="Segoe UI Symbol" w:cs="Segoe UI Symbol"/>
-        </w:rPr>
-        <w:t>✓</w:t>
-      </w:r>
-      <w:r>
-        <w:rPr>
-          <w:rStyle w:val="StringTok"/>
-        </w:rPr>
-        <w:t xml:space="preserve"> No overlaps detected between features</w:t>
-      </w:r>
-      <w:r>
-        <w:rPr>
-          <w:rStyle w:val="SpecialCharTok"/>
-        </w:rPr>
-        <w:t>\n</w:t>
-      </w:r>
-      <w:r>
-        <w:rPr>
-          <w:rStyle w:val="StringTok"/>
-        </w:rPr>
-        <w:t>"</w:t>
-      </w:r>
-      <w:r>
-        <w:rPr>
-          <w:rStyle w:val="NormalTok"/>
-        </w:rPr>
-        <w:t>)</w:t>
-      </w:r>
-      <w:r>
-        <w:br/>
-      </w:r>
-      <w:r>
-        <w:rPr>
-          <w:rStyle w:val="NormalTok"/>
-        </w:rPr>
-        <w:t xml:space="preserve">  }</w:t>
-      </w:r>
-      <w:r>
-        <w:br/>
-      </w:r>
-      <w:r>
-        <w:rPr>
-          <w:rStyle w:val="NormalTok"/>
-        </w:rPr>
-        <w:t xml:space="preserve">  </w:t>
-      </w:r>
-      <w:r>
-        <w:br/>
-      </w:r>
-      <w:r>
-        <w:rPr>
-          <w:rStyle w:val="NormalTok"/>
-        </w:rPr>
-        <w:t xml:space="preserve">  </w:t>
-      </w:r>
-      <w:r>
-        <w:rPr>
-          <w:rStyle w:val="CommentTok"/>
-        </w:rPr>
-        <w:t># Check for gaps</w:t>
-      </w:r>
-      <w:r>
-        <w:br/>
-      </w:r>
-      <w:r>
-        <w:rPr>
-          <w:rStyle w:val="NormalTok"/>
-        </w:rPr>
-        <w:t xml:space="preserve">  union_geom </w:t>
-      </w:r>
-      <w:r>
-        <w:rPr>
-          <w:rStyle w:val="OtherTok"/>
-        </w:rPr>
-        <w:t>&lt;-</w:t>
-      </w:r>
-      <w:r>
-        <w:rPr>
-          <w:rStyle w:val="NormalTok"/>
-        </w:rPr>
-        <w:t xml:space="preserve"> </w:t>
-      </w:r>
-      <w:r>
-        <w:rPr>
-          <w:rStyle w:val="FunctionTok"/>
-        </w:rPr>
-        <w:t>st_union</w:t>
-      </w:r>
-      <w:r>
-        <w:rPr>
-          <w:rStyle w:val="NormalTok"/>
-        </w:rPr>
-        <w:t>(accounting_area_proj)</w:t>
-      </w:r>
-      <w:r>
-        <w:br/>
-      </w:r>
-      <w:r>
-        <w:rPr>
-          <w:rStyle w:val="NormalTok"/>
-        </w:rPr>
-        <w:t xml:space="preserve">  dissolved_geom </w:t>
-      </w:r>
-      <w:r>
-        <w:rPr>
-          <w:rStyle w:val="OtherTok"/>
-        </w:rPr>
-        <w:t>&lt;-</w:t>
-      </w:r>
-      <w:r>
-        <w:rPr>
-          <w:rStyle w:val="NormalTok"/>
-        </w:rPr>
-        <w:t xml:space="preserve"> </w:t>
-      </w:r>
-      <w:r>
-        <w:rPr>
-          <w:rStyle w:val="FunctionTok"/>
-        </w:rPr>
-        <w:t>st_make_valid</w:t>
-      </w:r>
-      <w:r>
-        <w:rPr>
-          <w:rStyle w:val="NormalTok"/>
-        </w:rPr>
-        <w:t>(</w:t>
-      </w:r>
-      <w:r>
-        <w:rPr>
-          <w:rStyle w:val="FunctionTok"/>
-        </w:rPr>
-        <w:t>st_buffer</w:t>
-      </w:r>
-      <w:r>
-        <w:rPr>
-          <w:rStyle w:val="NormalTok"/>
-        </w:rPr>
-        <w:t xml:space="preserve">(union_geom, </w:t>
-      </w:r>
-      <w:r>
-        <w:rPr>
-          <w:rStyle w:val="AttributeTok"/>
-        </w:rPr>
-        <w:t>dist =</w:t>
-      </w:r>
-      <w:r>
-        <w:rPr>
-          <w:rStyle w:val="NormalTok"/>
-        </w:rPr>
-        <w:t xml:space="preserve"> </w:t>
-      </w:r>
-      <w:r>
-        <w:rPr>
-          <w:rStyle w:val="DecValTok"/>
-        </w:rPr>
-        <w:t>0</w:t>
-      </w:r>
-      <w:r>
-        <w:rPr>
-          <w:rStyle w:val="NormalTok"/>
-        </w:rPr>
-        <w:t>))</w:t>
-      </w:r>
-      <w:r>
-        <w:br/>
-      </w:r>
-      <w:r>
-        <w:rPr>
-          <w:rStyle w:val="NormalTok"/>
-        </w:rPr>
-        <w:t xml:space="preserve">  </w:t>
-      </w:r>
-      <w:r>
-        <w:br/>
-      </w:r>
-      <w:r>
-        <w:rPr>
-          <w:rStyle w:val="NormalTok"/>
-        </w:rPr>
-        <w:t xml:space="preserve">  </w:t>
-      </w:r>
-      <w:r>
-        <w:rPr>
-          <w:rStyle w:val="CommentTok"/>
-        </w:rPr>
-        <w:t># Area comparison to detect potential gaps</w:t>
-      </w:r>
-      <w:r>
-        <w:br/>
-      </w:r>
-      <w:r>
-        <w:rPr>
-          <w:rStyle w:val="NormalTok"/>
-        </w:rPr>
-        <w:t xml:space="preserve">  union_area </w:t>
-      </w:r>
-      <w:r>
-        <w:rPr>
-          <w:rStyle w:val="OtherTok"/>
-        </w:rPr>
-        <w:t>&lt;-</w:t>
-      </w:r>
-      <w:r>
-        <w:rPr>
-          <w:rStyle w:val="NormalTok"/>
-        </w:rPr>
-        <w:t xml:space="preserve"> </w:t>
-      </w:r>
-      <w:r>
-        <w:rPr>
-          <w:rStyle w:val="FunctionTok"/>
-        </w:rPr>
-        <w:t>st_area</w:t>
-      </w:r>
-      <w:r>
-        <w:rPr>
-          <w:rStyle w:val="NormalTok"/>
-        </w:rPr>
-        <w:t>(union_geom)</w:t>
-      </w:r>
-      <w:r>
-        <w:br/>
-      </w:r>
-      <w:r>
-        <w:rPr>
-          <w:rStyle w:val="NormalTok"/>
-        </w:rPr>
-        <w:t xml:space="preserve">  dissolved_area </w:t>
-      </w:r>
-      <w:r>
-        <w:rPr>
-          <w:rStyle w:val="OtherTok"/>
-        </w:rPr>
-        <w:t>&lt;-</w:t>
-      </w:r>
-      <w:r>
-        <w:rPr>
-          <w:rStyle w:val="NormalTok"/>
-        </w:rPr>
-        <w:t xml:space="preserve"> </w:t>
-      </w:r>
-      <w:r>
-        <w:rPr>
-          <w:rStyle w:val="FunctionTok"/>
-        </w:rPr>
-        <w:t>st_area</w:t>
-      </w:r>
-      <w:r>
-        <w:rPr>
-          <w:rStyle w:val="NormalTok"/>
-        </w:rPr>
-        <w:t>(dissolved_geom)</w:t>
-      </w:r>
-      <w:r>
-        <w:br/>
-      </w:r>
-      <w:r>
-        <w:rPr>
-          <w:rStyle w:val="NormalTok"/>
-        </w:rPr>
-        <w:t xml:space="preserve">  area_diff_pct </w:t>
-      </w:r>
-      <w:r>
-        <w:rPr>
-          <w:rStyle w:val="OtherTok"/>
-        </w:rPr>
-        <w:t>&lt;-</w:t>
-      </w:r>
-      <w:r>
-        <w:rPr>
-          <w:rStyle w:val="NormalTok"/>
-        </w:rPr>
-        <w:t xml:space="preserve"> </w:t>
-      </w:r>
-      <w:r>
-        <w:rPr>
-          <w:rStyle w:val="FunctionTok"/>
-        </w:rPr>
-        <w:t>abs</w:t>
-      </w:r>
-      <w:r>
-        <w:rPr>
-          <w:rStyle w:val="NormalTok"/>
-        </w:rPr>
-        <w:t>(</w:t>
-      </w:r>
-      <w:r>
-        <w:rPr>
-          <w:rStyle w:val="FunctionTok"/>
-        </w:rPr>
-        <w:t>as.numeric</w:t>
-      </w:r>
-      <w:r>
-        <w:rPr>
-          <w:rStyle w:val="NormalTok"/>
-        </w:rPr>
-        <w:t xml:space="preserve">(union_area </w:t>
-      </w:r>
-      <w:r>
-        <w:rPr>
-          <w:rStyle w:val="SpecialCharTok"/>
-        </w:rPr>
-        <w:t>-</w:t>
-      </w:r>
-      <w:r>
-        <w:rPr>
-          <w:rStyle w:val="NormalTok"/>
-        </w:rPr>
-        <w:t xml:space="preserve"> dissolved_area) </w:t>
-      </w:r>
-      <w:r>
-        <w:rPr>
-          <w:rStyle w:val="SpecialCharTok"/>
-        </w:rPr>
-        <w:t>/</w:t>
-      </w:r>
-      <w:r>
-        <w:rPr>
-          <w:rStyle w:val="NormalTok"/>
-        </w:rPr>
-        <w:t xml:space="preserve"> </w:t>
-      </w:r>
-      <w:r>
-        <w:rPr>
-          <w:rStyle w:val="FunctionTok"/>
-        </w:rPr>
-        <w:t>as.numeric</w:t>
-      </w:r>
-      <w:r>
-        <w:rPr>
-          <w:rStyle w:val="NormalTok"/>
-        </w:rPr>
-        <w:t xml:space="preserve">(union_area) </w:t>
-      </w:r>
-      <w:r>
-        <w:rPr>
-          <w:rStyle w:val="SpecialCharTok"/>
-        </w:rPr>
-        <w:t>*</w:t>
-      </w:r>
-      <w:r>
-        <w:rPr>
-          <w:rStyle w:val="NormalTok"/>
-        </w:rPr>
-        <w:t xml:space="preserve"> </w:t>
-      </w:r>
-      <w:r>
-        <w:rPr>
-          <w:rStyle w:val="DecValTok"/>
-        </w:rPr>
-        <w:t>100</w:t>
-      </w:r>
-      <w:r>
-        <w:rPr>
-          <w:rStyle w:val="NormalTok"/>
-        </w:rPr>
-        <w:t>)</w:t>
-      </w:r>
-      <w:r>
-        <w:br/>
-      </w:r>
-      <w:r>
-        <w:rPr>
-          <w:rStyle w:val="NormalTok"/>
-        </w:rPr>
-        <w:t xml:space="preserve">  </w:t>
-      </w:r>
-      <w:r>
-        <w:br/>
-      </w:r>
-      <w:r>
-        <w:rPr>
-          <w:rStyle w:val="NormalTok"/>
-        </w:rPr>
-        <w:t xml:space="preserve">  </w:t>
-      </w:r>
-      <w:r>
-        <w:rPr>
-          <w:rStyle w:val="FunctionTok"/>
-        </w:rPr>
-        <w:t>cat</w:t>
-      </w:r>
-      <w:r>
-        <w:rPr>
-          <w:rStyle w:val="NormalTok"/>
-        </w:rPr>
-        <w:t>(</w:t>
-      </w:r>
-      <w:r>
-        <w:rPr>
-          <w:rStyle w:val="StringTok"/>
-        </w:rPr>
-        <w:t>"</w:t>
-      </w:r>
-      <w:r>
-        <w:rPr>
-          <w:rStyle w:val="SpecialCharTok"/>
-        </w:rPr>
-        <w:t>\n</w:t>
-      </w:r>
-      <w:r>
-        <w:rPr>
-          <w:rStyle w:val="StringTok"/>
-        </w:rPr>
-        <w:t>Gap Analysis:</w:t>
-      </w:r>
-      <w:r>
-        <w:rPr>
-          <w:rStyle w:val="SpecialCharTok"/>
-        </w:rPr>
-        <w:t>\n</w:t>
-      </w:r>
-      <w:r>
-        <w:rPr>
-          <w:rStyle w:val="StringTok"/>
-        </w:rPr>
-        <w:t>"</w:t>
-      </w:r>
-      <w:r>
-        <w:rPr>
-          <w:rStyle w:val="NormalTok"/>
-        </w:rPr>
-        <w:t>)</w:t>
-      </w:r>
-      <w:r>
-        <w:br/>
-      </w:r>
-      <w:r>
-        <w:rPr>
-          <w:rStyle w:val="NormalTok"/>
-        </w:rPr>
-        <w:t xml:space="preserve">  </w:t>
-      </w:r>
-      <w:r>
-        <w:rPr>
-          <w:rStyle w:val="FunctionTok"/>
-        </w:rPr>
-        <w:t>cat</w:t>
-      </w:r>
-      <w:r>
-        <w:rPr>
-          <w:rStyle w:val="NormalTok"/>
-        </w:rPr>
-        <w:t>(</w:t>
-      </w:r>
-      <w:r>
-        <w:rPr>
-          <w:rStyle w:val="StringTok"/>
-        </w:rPr>
-        <w:t>"Union area:"</w:t>
-      </w:r>
-      <w:r>
-        <w:rPr>
-          <w:rStyle w:val="NormalTok"/>
-        </w:rPr>
-        <w:t xml:space="preserve">, </w:t>
-      </w:r>
-      <w:r>
-        <w:rPr>
-          <w:rStyle w:val="FunctionTok"/>
-        </w:rPr>
-        <w:t>format</w:t>
-      </w:r>
-      <w:r>
-        <w:rPr>
-          <w:rStyle w:val="NormalTok"/>
-        </w:rPr>
-        <w:t>(</w:t>
-      </w:r>
-      <w:r>
-        <w:rPr>
-          <w:rStyle w:val="FunctionTok"/>
-        </w:rPr>
-        <w:t>as.numeric</w:t>
-      </w:r>
-      <w:r>
-        <w:rPr>
-          <w:rStyle w:val="NormalTok"/>
-        </w:rPr>
-        <w:t xml:space="preserve">(union_area), </w:t>
-      </w:r>
-      <w:r>
-        <w:rPr>
-          <w:rStyle w:val="AttributeTok"/>
-        </w:rPr>
-        <w:t>scientific =</w:t>
-      </w:r>
-      <w:r>
-        <w:rPr>
-          <w:rStyle w:val="NormalTok"/>
-        </w:rPr>
-        <w:t xml:space="preserve"> </w:t>
-      </w:r>
-      <w:r>
-        <w:rPr>
-          <w:rStyle w:val="ConstantTok"/>
-        </w:rPr>
-        <w:t>FALSE</w:t>
-      </w:r>
-      <w:r>
-        <w:rPr>
-          <w:rStyle w:val="NormalTok"/>
-        </w:rPr>
-        <w:t xml:space="preserve">), </w:t>
-      </w:r>
-      <w:r>
-        <w:rPr>
-          <w:rStyle w:val="StringTok"/>
-        </w:rPr>
-        <w:t>"m²</w:t>
-      </w:r>
-      <w:r>
-        <w:rPr>
-          <w:rStyle w:val="SpecialCharTok"/>
-        </w:rPr>
-        <w:t>\n</w:t>
-      </w:r>
-      <w:r>
-        <w:rPr>
-          <w:rStyle w:val="StringTok"/>
-        </w:rPr>
-        <w:t>"</w:t>
-      </w:r>
-      <w:r>
-        <w:rPr>
-          <w:rStyle w:val="NormalTok"/>
-        </w:rPr>
-        <w:t>)</w:t>
-      </w:r>
-      <w:r>
-        <w:br/>
-      </w:r>
-      <w:r>
-        <w:rPr>
-          <w:rStyle w:val="NormalTok"/>
-        </w:rPr>
-        <w:t xml:space="preserve">  </w:t>
-      </w:r>
-      <w:r>
-        <w:rPr>
-          <w:rStyle w:val="FunctionTok"/>
-        </w:rPr>
-        <w:t>cat</w:t>
-      </w:r>
-      <w:r>
-        <w:rPr>
-          <w:rStyle w:val="NormalTok"/>
-        </w:rPr>
-        <w:t>(</w:t>
-      </w:r>
-      <w:r>
-        <w:rPr>
-          <w:rStyle w:val="StringTok"/>
-        </w:rPr>
-        <w:t>"Dissolved area:"</w:t>
-      </w:r>
-      <w:r>
-        <w:rPr>
-          <w:rStyle w:val="NormalTok"/>
-        </w:rPr>
-        <w:t xml:space="preserve">, </w:t>
-      </w:r>
-      <w:r>
-        <w:rPr>
-          <w:rStyle w:val="FunctionTok"/>
-        </w:rPr>
-        <w:t>format</w:t>
-      </w:r>
-      <w:r>
-        <w:rPr>
-          <w:rStyle w:val="NormalTok"/>
-        </w:rPr>
-        <w:t>(</w:t>
-      </w:r>
-      <w:r>
-        <w:rPr>
-          <w:rStyle w:val="FunctionTok"/>
-        </w:rPr>
-        <w:t>as.numeric</w:t>
-      </w:r>
-      <w:r>
-        <w:rPr>
-          <w:rStyle w:val="NormalTok"/>
-        </w:rPr>
-        <w:t xml:space="preserve">(dissolved_area), </w:t>
-      </w:r>
-      <w:r>
-        <w:rPr>
-          <w:rStyle w:val="AttributeTok"/>
-        </w:rPr>
-        <w:t>scientific =</w:t>
-      </w:r>
-      <w:r>
-        <w:rPr>
-          <w:rStyle w:val="NormalTok"/>
-        </w:rPr>
-        <w:t xml:space="preserve"> </w:t>
-      </w:r>
-      <w:r>
-        <w:rPr>
-          <w:rStyle w:val="ConstantTok"/>
-        </w:rPr>
-        <w:t>FALSE</w:t>
-      </w:r>
-      <w:r>
-        <w:rPr>
-          <w:rStyle w:val="NormalTok"/>
-        </w:rPr>
-        <w:t xml:space="preserve">), </w:t>
-      </w:r>
-      <w:r>
-        <w:rPr>
-          <w:rStyle w:val="StringTok"/>
-        </w:rPr>
-        <w:t>"m²</w:t>
-      </w:r>
-      <w:r>
-        <w:rPr>
-          <w:rStyle w:val="SpecialCharTok"/>
-        </w:rPr>
-        <w:t>\n</w:t>
-      </w:r>
-      <w:r>
-        <w:rPr>
-          <w:rStyle w:val="StringTok"/>
-        </w:rPr>
-        <w:t>"</w:t>
-      </w:r>
-      <w:r>
-        <w:rPr>
-          <w:rStyle w:val="NormalTok"/>
-        </w:rPr>
-        <w:t>)</w:t>
-      </w:r>
-      <w:r>
-        <w:br/>
-      </w:r>
-      <w:r>
-        <w:rPr>
-          <w:rStyle w:val="NormalTok"/>
-        </w:rPr>
-        <w:t xml:space="preserve">  </w:t>
-      </w:r>
-      <w:r>
-        <w:rPr>
-          <w:rStyle w:val="FunctionTok"/>
-        </w:rPr>
-        <w:t>cat</w:t>
-      </w:r>
-      <w:r>
-        <w:rPr>
-          <w:rStyle w:val="NormalTok"/>
-        </w:rPr>
-        <w:t>(</w:t>
-      </w:r>
-      <w:r>
-        <w:rPr>
-          <w:rStyle w:val="StringTok"/>
-        </w:rPr>
-        <w:t>"Difference:"</w:t>
-      </w:r>
-      <w:r>
-        <w:rPr>
-          <w:rStyle w:val="NormalTok"/>
-        </w:rPr>
-        <w:t xml:space="preserve">, </w:t>
-      </w:r>
-      <w:r>
-        <w:rPr>
-          <w:rStyle w:val="FunctionTok"/>
-        </w:rPr>
-        <w:t>format</w:t>
-      </w:r>
-      <w:r>
-        <w:rPr>
-          <w:rStyle w:val="NormalTok"/>
-        </w:rPr>
-        <w:t xml:space="preserve">(area_diff_pct, </w:t>
-      </w:r>
-      <w:r>
-        <w:rPr>
-          <w:rStyle w:val="AttributeTok"/>
-        </w:rPr>
-        <w:t>digits =</w:t>
-      </w:r>
-      <w:r>
-        <w:rPr>
-          <w:rStyle w:val="NormalTok"/>
-        </w:rPr>
-        <w:t xml:space="preserve"> </w:t>
-      </w:r>
-      <w:r>
-        <w:rPr>
-          <w:rStyle w:val="DecValTok"/>
-        </w:rPr>
-        <w:t>4</w:t>
-      </w:r>
-      <w:r>
-        <w:rPr>
-          <w:rStyle w:val="NormalTok"/>
-        </w:rPr>
-        <w:t xml:space="preserve">), </w:t>
-      </w:r>
-      <w:r>
-        <w:rPr>
-          <w:rStyle w:val="StringTok"/>
-        </w:rPr>
-        <w:t>"%</w:t>
-      </w:r>
-      <w:r>
-        <w:rPr>
-          <w:rStyle w:val="SpecialCharTok"/>
-        </w:rPr>
-        <w:t>\n</w:t>
-      </w:r>
-      <w:r>
-        <w:rPr>
-          <w:rStyle w:val="StringTok"/>
-        </w:rPr>
-        <w:t>"</w:t>
-      </w:r>
-      <w:r>
-        <w:rPr>
-          <w:rStyle w:val="NormalTok"/>
-        </w:rPr>
-        <w:t>)</w:t>
-      </w:r>
-      <w:r>
-        <w:br/>
-      </w:r>
-      <w:r>
-        <w:rPr>
-          <w:rStyle w:val="NormalTok"/>
-        </w:rPr>
         <w:t xml:space="preserve">  </w:t>
       </w:r>
       <w:r>
@@ -8152,7 +8152,6 @@
       <w:bookmarkStart w:id="21" w:name="small-polygon-detection"/>
       <w:bookmarkEnd w:id="19"/>
       <w:r>
-        <w:lastRenderedPageBreak/>
         <w:t>7. Small Polygon Detection</w:t>
       </w:r>
       <w:bookmarkEnd w:id="20"/>
@@ -8912,6 +8911,7 @@
       <w:bookmarkStart w:id="23" w:name="Xf862a6789f20729f542ac56861f1baf69d7acb1"/>
       <w:bookmarkEnd w:id="21"/>
       <w:r>
+        <w:lastRenderedPageBreak/>
         <w:t>8. Administrative Boundary Correspondence Check</w:t>
       </w:r>
       <w:bookmarkEnd w:id="22"/>
@@ -9903,7 +9903,6 @@
       <w:bookmarkStart w:id="25" w:name="export-geometric-issues"/>
       <w:bookmarkEnd w:id="23"/>
       <w:r>
-        <w:lastRenderedPageBreak/>
         <w:t>9. Export Geometric Issues</w:t>
       </w:r>
       <w:bookmarkEnd w:id="24"/>
@@ -10804,6 +10803,7 @@
       <w:bookmarkStart w:id="27" w:name="visualization"/>
       <w:bookmarkEnd w:id="25"/>
       <w:r>
+        <w:lastRenderedPageBreak/>
         <w:t>10. Visualization</w:t>
       </w:r>
       <w:bookmarkEnd w:id="26"/>
@@ -11533,7 +11533,6 @@
         <w:rPr>
           <w:rStyle w:val="NormalTok"/>
         </w:rPr>
-        <w:lastRenderedPageBreak/>
         <w:t xml:space="preserve">  </w:t>
       </w:r>
       <w:r>
@@ -12508,7 +12507,7 @@
         <w:rPr>
           <w:noProof/>
         </w:rPr>
-        <w:pict w14:anchorId="74AFB37C">
+        <w:pict w14:anchorId="00EBAEDE">
           <v:rect id="_x0000_i1028" alt="" style="width:468pt;height:.05pt;mso-width-percent:0;mso-height-percent:0;mso-width-percent:0;mso-height-percent:0" o:hralign="center" o:hrstd="t" o:hr="t"/>
         </w:pict>
       </w:r>
@@ -12662,6 +12661,7 @@
         <w:rPr>
           <w:rStyle w:val="NormalTok"/>
         </w:rPr>
+        <w:lastRenderedPageBreak/>
         <w:t xml:space="preserve">    </w:t>
       </w:r>
       <w:r>
@@ -14771,6 +14771,7 @@
       <w:bookmarkStart w:id="39" w:name="boundary-integrity"/>
       <w:bookmarkEnd w:id="37"/>
       <w:r>
+        <w:lastRenderedPageBreak/>
         <w:t>3. Boundary Integrity</w:t>
       </w:r>
       <w:bookmarkEnd w:id="38"/>
@@ -14944,7 +14945,7 @@
         <w:rPr>
           <w:noProof/>
         </w:rPr>
-        <w:pict w14:anchorId="6F860402">
+        <w:pict w14:anchorId="40CA24F4">
           <v:rect id="_x0000_i1027" alt="" style="width:468pt;height:.05pt;mso-width-percent:0;mso-height-percent:0;mso-width-percent:0;mso-height-percent:0" o:hralign="center" o:hrstd="t" o:hr="t"/>
         </w:pict>
       </w:r>
@@ -15039,7 +15040,7 @@
         <w:rPr>
           <w:noProof/>
         </w:rPr>
-        <w:pict w14:anchorId="613B8826">
+        <w:pict w14:anchorId="25E13D1A">
           <v:rect id="_x0000_i1026" alt="" style="width:468pt;height:.05pt;mso-width-percent:0;mso-height-percent:0;mso-width-percent:0;mso-height-percent:0" o:hralign="center" o:hrstd="t" o:hr="t"/>
         </w:pict>
       </w:r>
@@ -15078,7 +15079,7 @@
         <w:rPr>
           <w:noProof/>
         </w:rPr>
-        <w:pict w14:anchorId="5E603F71">
+        <w:pict w14:anchorId="06DAD31B">
           <v:rect id="_x0000_i1025" alt="" style="width:468pt;height:.05pt;mso-width-percent:0;mso-height-percent:0;mso-width-percent:0;mso-height-percent:0" o:hralign="center" o:hrstd="t" o:hr="t"/>
         </w:pict>
       </w:r>
@@ -15108,6 +15109,7 @@
         </w:numPr>
       </w:pPr>
       <w:r>
+        <w:lastRenderedPageBreak/>
         <w:t>Forest cover classification validation</w:t>
       </w:r>
     </w:p>
@@ -15160,6 +15162,146 @@
       </w:r>
       <w:bookmarkEnd w:id="29"/>
       <w:bookmarkEnd w:id="45"/>
+    </w:p>
+    <w:p>
+      <w:pPr>
+        <w:pStyle w:val="Compact"/>
+      </w:pPr>
+    </w:p>
+    <w:p>
+      <w:pPr>
+        <w:pStyle w:val="Compact"/>
+      </w:pPr>
+    </w:p>
+    <w:p>
+      <w:pPr>
+        <w:pStyle w:val="Compact"/>
+      </w:pPr>
+    </w:p>
+    <w:tbl>
+      <w:tblPr>
+        <w:tblStyle w:val="TableGrid"/>
+        <w:tblW w:w="0" w:type="auto"/>
+        <w:tblLook w:val="04A0" w:firstRow="1" w:lastRow="0" w:firstColumn="1" w:lastColumn="0" w:noHBand="0" w:noVBand="1"/>
+      </w:tblPr>
+      <w:tblGrid>
+        <w:gridCol w:w="3116"/>
+        <w:gridCol w:w="3117"/>
+        <w:gridCol w:w="3117"/>
+      </w:tblGrid>
+      <w:tr>
+        <w:tc>
+          <w:tcPr>
+            <w:tcW w:w="3116" w:type="dxa"/>
+          </w:tcPr>
+          <w:p>
+            <w:pPr>
+              <w:pStyle w:val="Compact"/>
+            </w:pPr>
+            <w:r>
+              <w:t>aDF,MNasd</w:t>
+            </w:r>
+          </w:p>
+        </w:tc>
+        <w:tc>
+          <w:tcPr>
+            <w:tcW w:w="3117" w:type="dxa"/>
+          </w:tcPr>
+          <w:p>
+            <w:pPr>
+              <w:pStyle w:val="Compact"/>
+            </w:pPr>
+            <w:r>
+              <w:t>asdasDFL</w:t>
+            </w:r>
+          </w:p>
+        </w:tc>
+        <w:tc>
+          <w:tcPr>
+            <w:tcW w:w="3117" w:type="dxa"/>
+          </w:tcPr>
+          <w:p>
+            <w:pPr>
+              <w:pStyle w:val="Compact"/>
+            </w:pPr>
+          </w:p>
+        </w:tc>
+      </w:tr>
+      <w:tr>
+        <w:tc>
+          <w:tcPr>
+            <w:tcW w:w="3116" w:type="dxa"/>
+          </w:tcPr>
+          <w:p>
+            <w:pPr>
+              <w:pStyle w:val="Compact"/>
+            </w:pPr>
+            <w:r>
+              <w:t>asD.MAS./DFM</w:t>
+            </w:r>
+          </w:p>
+        </w:tc>
+        <w:tc>
+          <w:tcPr>
+            <w:tcW w:w="3117" w:type="dxa"/>
+          </w:tcPr>
+          <w:p>
+            <w:pPr>
+              <w:pStyle w:val="Compact"/>
+            </w:pPr>
+          </w:p>
+        </w:tc>
+        <w:tc>
+          <w:tcPr>
+            <w:tcW w:w="3117" w:type="dxa"/>
+          </w:tcPr>
+          <w:p>
+            <w:pPr>
+              <w:pStyle w:val="Compact"/>
+            </w:pPr>
+          </w:p>
+        </w:tc>
+      </w:tr>
+      <w:tr>
+        <w:tc>
+          <w:tcPr>
+            <w:tcW w:w="3116" w:type="dxa"/>
+          </w:tcPr>
+          <w:p>
+            <w:pPr>
+              <w:pStyle w:val="Compact"/>
+            </w:pPr>
+            <w:r>
+              <w:t>Alsdjna;lsDN</w:t>
+            </w:r>
+          </w:p>
+        </w:tc>
+        <w:tc>
+          <w:tcPr>
+            <w:tcW w:w="3117" w:type="dxa"/>
+          </w:tcPr>
+          <w:p>
+            <w:pPr>
+              <w:pStyle w:val="Compact"/>
+            </w:pPr>
+          </w:p>
+        </w:tc>
+        <w:tc>
+          <w:tcPr>
+            <w:tcW w:w="3117" w:type="dxa"/>
+          </w:tcPr>
+          <w:p>
+            <w:pPr>
+              <w:pStyle w:val="Compact"/>
+            </w:pPr>
+          </w:p>
+        </w:tc>
+      </w:tr>
+    </w:tbl>
+    <w:p>
+      <w:pPr>
+        <w:pStyle w:val="Compact"/>
+      </w:pPr>
     </w:p>
     <w:sectPr>
       <w:footerReference w:type="even" r:id="rId7"/>
@@ -16017,6 +16159,178 @@
     </w:lvl>
   </w:abstractNum>
   <w:abstractNum w:abstractNumId="7" w15:restartNumberingAfterBreak="0">
+    <w:nsid w:val="183155A9"/>
+    <w:multiLevelType w:val="hybridMultilevel"/>
+    <w:tmpl w:val="00B21AC4"/>
+    <w:lvl w:ilvl="0" w:tplc="0409000F">
+      <w:start w:val="1"/>
+      <w:numFmt w:val="decimal"/>
+      <w:lvlText w:val="%1."/>
+      <w:lvlJc w:val="left"/>
+      <w:pPr>
+        <w:ind w:left="720" w:hanging="360"/>
+      </w:pPr>
+    </w:lvl>
+    <w:lvl w:ilvl="1" w:tplc="04090019" w:tentative="1">
+      <w:start w:val="1"/>
+      <w:numFmt w:val="lowerLetter"/>
+      <w:lvlText w:val="%2."/>
+      <w:lvlJc w:val="left"/>
+      <w:pPr>
+        <w:ind w:left="1440" w:hanging="360"/>
+      </w:pPr>
+    </w:lvl>
+    <w:lvl w:ilvl="2" w:tplc="0409001B" w:tentative="1">
+      <w:start w:val="1"/>
+      <w:numFmt w:val="lowerRoman"/>
+      <w:lvlText w:val="%3."/>
+      <w:lvlJc w:val="right"/>
+      <w:pPr>
+        <w:ind w:left="2160" w:hanging="180"/>
+      </w:pPr>
+    </w:lvl>
+    <w:lvl w:ilvl="3" w:tplc="0409000F" w:tentative="1">
+      <w:start w:val="1"/>
+      <w:numFmt w:val="decimal"/>
+      <w:lvlText w:val="%4."/>
+      <w:lvlJc w:val="left"/>
+      <w:pPr>
+        <w:ind w:left="2880" w:hanging="360"/>
+      </w:pPr>
+    </w:lvl>
+    <w:lvl w:ilvl="4" w:tplc="04090019" w:tentative="1">
+      <w:start w:val="1"/>
+      <w:numFmt w:val="lowerLetter"/>
+      <w:lvlText w:val="%5."/>
+      <w:lvlJc w:val="left"/>
+      <w:pPr>
+        <w:ind w:left="3600" w:hanging="360"/>
+      </w:pPr>
+    </w:lvl>
+    <w:lvl w:ilvl="5" w:tplc="0409001B" w:tentative="1">
+      <w:start w:val="1"/>
+      <w:numFmt w:val="lowerRoman"/>
+      <w:lvlText w:val="%6."/>
+      <w:lvlJc w:val="right"/>
+      <w:pPr>
+        <w:ind w:left="4320" w:hanging="180"/>
+      </w:pPr>
+    </w:lvl>
+    <w:lvl w:ilvl="6" w:tplc="0409000F" w:tentative="1">
+      <w:start w:val="1"/>
+      <w:numFmt w:val="decimal"/>
+      <w:lvlText w:val="%7."/>
+      <w:lvlJc w:val="left"/>
+      <w:pPr>
+        <w:ind w:left="5040" w:hanging="360"/>
+      </w:pPr>
+    </w:lvl>
+    <w:lvl w:ilvl="7" w:tplc="04090019" w:tentative="1">
+      <w:start w:val="1"/>
+      <w:numFmt w:val="lowerLetter"/>
+      <w:lvlText w:val="%8."/>
+      <w:lvlJc w:val="left"/>
+      <w:pPr>
+        <w:ind w:left="5760" w:hanging="360"/>
+      </w:pPr>
+    </w:lvl>
+    <w:lvl w:ilvl="8" w:tplc="0409001B" w:tentative="1">
+      <w:start w:val="1"/>
+      <w:numFmt w:val="lowerRoman"/>
+      <w:lvlText w:val="%9."/>
+      <w:lvlJc w:val="right"/>
+      <w:pPr>
+        <w:ind w:left="6480" w:hanging="180"/>
+      </w:pPr>
+    </w:lvl>
+  </w:abstractNum>
+  <w:abstractNum w:abstractNumId="8" w15:restartNumberingAfterBreak="0">
+    <w:nsid w:val="1F7D2A02"/>
+    <w:multiLevelType w:val="hybridMultilevel"/>
+    <w:tmpl w:val="7CBA5146"/>
+    <w:lvl w:ilvl="0" w:tplc="0409000F">
+      <w:start w:val="1"/>
+      <w:numFmt w:val="decimal"/>
+      <w:lvlText w:val="%1."/>
+      <w:lvlJc w:val="left"/>
+      <w:pPr>
+        <w:ind w:left="720" w:hanging="360"/>
+      </w:pPr>
+    </w:lvl>
+    <w:lvl w:ilvl="1" w:tplc="04090019" w:tentative="1">
+      <w:start w:val="1"/>
+      <w:numFmt w:val="lowerLetter"/>
+      <w:lvlText w:val="%2."/>
+      <w:lvlJc w:val="left"/>
+      <w:pPr>
+        <w:ind w:left="1440" w:hanging="360"/>
+      </w:pPr>
+    </w:lvl>
+    <w:lvl w:ilvl="2" w:tplc="0409001B" w:tentative="1">
+      <w:start w:val="1"/>
+      <w:numFmt w:val="lowerRoman"/>
+      <w:lvlText w:val="%3."/>
+      <w:lvlJc w:val="right"/>
+      <w:pPr>
+        <w:ind w:left="2160" w:hanging="180"/>
+      </w:pPr>
+    </w:lvl>
+    <w:lvl w:ilvl="3" w:tplc="0409000F" w:tentative="1">
+      <w:start w:val="1"/>
+      <w:numFmt w:val="decimal"/>
+      <w:lvlText w:val="%4."/>
+      <w:lvlJc w:val="left"/>
+      <w:pPr>
+        <w:ind w:left="2880" w:hanging="360"/>
+      </w:pPr>
+    </w:lvl>
+    <w:lvl w:ilvl="4" w:tplc="04090019" w:tentative="1">
+      <w:start w:val="1"/>
+      <w:numFmt w:val="lowerLetter"/>
+      <w:lvlText w:val="%5."/>
+      <w:lvlJc w:val="left"/>
+      <w:pPr>
+        <w:ind w:left="3600" w:hanging="360"/>
+      </w:pPr>
+    </w:lvl>
+    <w:lvl w:ilvl="5" w:tplc="0409001B" w:tentative="1">
+      <w:start w:val="1"/>
+      <w:numFmt w:val="lowerRoman"/>
+      <w:lvlText w:val="%6."/>
+      <w:lvlJc w:val="right"/>
+      <w:pPr>
+        <w:ind w:left="4320" w:hanging="180"/>
+      </w:pPr>
+    </w:lvl>
+    <w:lvl w:ilvl="6" w:tplc="0409000F" w:tentative="1">
+      <w:start w:val="1"/>
+      <w:numFmt w:val="decimal"/>
+      <w:lvlText w:val="%7."/>
+      <w:lvlJc w:val="left"/>
+      <w:pPr>
+        <w:ind w:left="5040" w:hanging="360"/>
+      </w:pPr>
+    </w:lvl>
+    <w:lvl w:ilvl="7" w:tplc="04090019" w:tentative="1">
+      <w:start w:val="1"/>
+      <w:numFmt w:val="lowerLetter"/>
+      <w:lvlText w:val="%8."/>
+      <w:lvlJc w:val="left"/>
+      <w:pPr>
+        <w:ind w:left="5760" w:hanging="360"/>
+      </w:pPr>
+    </w:lvl>
+    <w:lvl w:ilvl="8" w:tplc="0409001B" w:tentative="1">
+      <w:start w:val="1"/>
+      <w:numFmt w:val="lowerRoman"/>
+      <w:lvlText w:val="%9."/>
+      <w:lvlJc w:val="right"/>
+      <w:pPr>
+        <w:ind w:left="6480" w:hanging="180"/>
+      </w:pPr>
+    </w:lvl>
+  </w:abstractNum>
+  <w:abstractNum w:abstractNumId="9" w15:restartNumberingAfterBreak="0">
     <w:nsid w:val="21D47B03"/>
     <w:multiLevelType w:val="multilevel"/>
     <w:tmpl w:val="34AE7232"/>
@@ -16121,7 +16435,7 @@
       </w:rPr>
     </w:lvl>
   </w:abstractNum>
-  <w:abstractNum w:abstractNumId="8" w15:restartNumberingAfterBreak="0">
+  <w:abstractNum w:abstractNumId="10" w15:restartNumberingAfterBreak="0">
     <w:nsid w:val="3DD54880"/>
     <w:multiLevelType w:val="multilevel"/>
     <w:tmpl w:val="8B3868A4"/>
@@ -16225,14 +16539,103 @@
       </w:rPr>
     </w:lvl>
   </w:abstractNum>
-  <w:abstractNum w:abstractNumId="9" w15:restartNumberingAfterBreak="0">
+  <w:abstractNum w:abstractNumId="11" w15:restartNumberingAfterBreak="0">
+    <w:nsid w:val="3EFF6FAB"/>
+    <w:multiLevelType w:val="multilevel"/>
+    <w:tmpl w:val="3000BC58"/>
+    <w:styleLink w:val="CurrentList6"/>
+    <w:lvl w:ilvl="0">
+      <w:start w:val="1"/>
+      <w:numFmt w:val="decimal"/>
+      <w:lvlText w:val="%1."/>
+      <w:lvlJc w:val="left"/>
+      <w:pPr>
+        <w:ind w:left="360" w:hanging="360"/>
+      </w:pPr>
+      <w:rPr>
+        <w:rFonts w:hint="default"/>
+      </w:rPr>
+    </w:lvl>
+    <w:lvl w:ilvl="1">
+      <w:start w:val="1"/>
+      <w:numFmt w:val="lowerLetter"/>
+      <w:lvlText w:val="%2."/>
+      <w:lvlJc w:val="left"/>
+      <w:pPr>
+        <w:ind w:left="1080" w:hanging="360"/>
+      </w:pPr>
+    </w:lvl>
+    <w:lvl w:ilvl="2">
+      <w:start w:val="1"/>
+      <w:numFmt w:val="lowerRoman"/>
+      <w:lvlText w:val="%3."/>
+      <w:lvlJc w:val="right"/>
+      <w:pPr>
+        <w:ind w:left="1800" w:hanging="180"/>
+      </w:pPr>
+    </w:lvl>
+    <w:lvl w:ilvl="3">
+      <w:start w:val="1"/>
+      <w:numFmt w:val="decimal"/>
+      <w:lvlText w:val="%4."/>
+      <w:lvlJc w:val="left"/>
+      <w:pPr>
+        <w:ind w:left="2520" w:hanging="360"/>
+      </w:pPr>
+    </w:lvl>
+    <w:lvl w:ilvl="4">
+      <w:start w:val="1"/>
+      <w:numFmt w:val="lowerLetter"/>
+      <w:lvlText w:val="%5."/>
+      <w:lvlJc w:val="left"/>
+      <w:pPr>
+        <w:ind w:left="3240" w:hanging="360"/>
+      </w:pPr>
+    </w:lvl>
+    <w:lvl w:ilvl="5">
+      <w:start w:val="1"/>
+      <w:numFmt w:val="lowerRoman"/>
+      <w:lvlText w:val="%6."/>
+      <w:lvlJc w:val="right"/>
+      <w:pPr>
+        <w:ind w:left="3960" w:hanging="180"/>
+      </w:pPr>
+    </w:lvl>
+    <w:lvl w:ilvl="6">
+      <w:start w:val="1"/>
+      <w:numFmt w:val="decimal"/>
+      <w:lvlText w:val="%7."/>
+      <w:lvlJc w:val="left"/>
+      <w:pPr>
+        <w:ind w:left="4680" w:hanging="360"/>
+      </w:pPr>
+    </w:lvl>
+    <w:lvl w:ilvl="7">
+      <w:start w:val="1"/>
+      <w:numFmt w:val="lowerLetter"/>
+      <w:lvlText w:val="%8."/>
+      <w:lvlJc w:val="left"/>
+      <w:pPr>
+        <w:ind w:left="5400" w:hanging="360"/>
+      </w:pPr>
+    </w:lvl>
+    <w:lvl w:ilvl="8">
+      <w:start w:val="1"/>
+      <w:numFmt w:val="lowerRoman"/>
+      <w:lvlText w:val="%9."/>
+      <w:lvlJc w:val="right"/>
+      <w:pPr>
+        <w:ind w:left="6120" w:hanging="180"/>
+      </w:pPr>
+    </w:lvl>
+  </w:abstractNum>
+  <w:abstractNum w:abstractNumId="12" w15:restartNumberingAfterBreak="0">
     <w:nsid w:val="45324C72"/>
     <w:multiLevelType w:val="hybridMultilevel"/>
-    <w:tmpl w:val="3B0EE8BC"/>
-    <w:lvl w:ilvl="0" w:tplc="0CBC01EC">
+    <w:tmpl w:val="3000BC58"/>
+    <w:lvl w:ilvl="0" w:tplc="F3A49EEA">
       <w:start w:val="1"/>
       <w:numFmt w:val="decimal"/>
-      <w:pStyle w:val="Heading3"/>
       <w:lvlText w:val="%1."/>
       <w:lvlJc w:val="left"/>
       <w:pPr>
@@ -16315,7 +16718,96 @@
       </w:pPr>
     </w:lvl>
   </w:abstractNum>
-  <w:abstractNum w:abstractNumId="10" w15:restartNumberingAfterBreak="0">
+  <w:abstractNum w:abstractNumId="13" w15:restartNumberingAfterBreak="0">
+    <w:nsid w:val="46741D39"/>
+    <w:multiLevelType w:val="hybridMultilevel"/>
+    <w:tmpl w:val="EC0292FC"/>
+    <w:lvl w:ilvl="0" w:tplc="0409000F">
+      <w:start w:val="1"/>
+      <w:numFmt w:val="decimal"/>
+      <w:lvlText w:val="%1."/>
+      <w:lvlJc w:val="left"/>
+      <w:pPr>
+        <w:ind w:left="720" w:hanging="360"/>
+      </w:pPr>
+      <w:rPr>
+        <w:rFonts w:hint="default"/>
+      </w:rPr>
+    </w:lvl>
+    <w:lvl w:ilvl="1" w:tplc="04090019" w:tentative="1">
+      <w:start w:val="1"/>
+      <w:numFmt w:val="lowerLetter"/>
+      <w:lvlText w:val="%2."/>
+      <w:lvlJc w:val="left"/>
+      <w:pPr>
+        <w:ind w:left="1440" w:hanging="360"/>
+      </w:pPr>
+    </w:lvl>
+    <w:lvl w:ilvl="2" w:tplc="0409001B" w:tentative="1">
+      <w:start w:val="1"/>
+      <w:numFmt w:val="lowerRoman"/>
+      <w:lvlText w:val="%3."/>
+      <w:lvlJc w:val="right"/>
+      <w:pPr>
+        <w:ind w:left="2160" w:hanging="180"/>
+      </w:pPr>
+    </w:lvl>
+    <w:lvl w:ilvl="3" w:tplc="0409000F" w:tentative="1">
+      <w:start w:val="1"/>
+      <w:numFmt w:val="decimal"/>
+      <w:lvlText w:val="%4."/>
+      <w:lvlJc w:val="left"/>
+      <w:pPr>
+        <w:ind w:left="2880" w:hanging="360"/>
+      </w:pPr>
+    </w:lvl>
+    <w:lvl w:ilvl="4" w:tplc="04090019" w:tentative="1">
+      <w:start w:val="1"/>
+      <w:numFmt w:val="lowerLetter"/>
+      <w:lvlText w:val="%5."/>
+      <w:lvlJc w:val="left"/>
+      <w:pPr>
+        <w:ind w:left="3600" w:hanging="360"/>
+      </w:pPr>
+    </w:lvl>
+    <w:lvl w:ilvl="5" w:tplc="0409001B" w:tentative="1">
+      <w:start w:val="1"/>
+      <w:numFmt w:val="lowerRoman"/>
+      <w:lvlText w:val="%6."/>
+      <w:lvlJc w:val="right"/>
+      <w:pPr>
+        <w:ind w:left="4320" w:hanging="180"/>
+      </w:pPr>
+    </w:lvl>
+    <w:lvl w:ilvl="6" w:tplc="0409000F" w:tentative="1">
+      <w:start w:val="1"/>
+      <w:numFmt w:val="decimal"/>
+      <w:lvlText w:val="%7."/>
+      <w:lvlJc w:val="left"/>
+      <w:pPr>
+        <w:ind w:left="5040" w:hanging="360"/>
+      </w:pPr>
+    </w:lvl>
+    <w:lvl w:ilvl="7" w:tplc="04090019" w:tentative="1">
+      <w:start w:val="1"/>
+      <w:numFmt w:val="lowerLetter"/>
+      <w:lvlText w:val="%8."/>
+      <w:lvlJc w:val="left"/>
+      <w:pPr>
+        <w:ind w:left="5760" w:hanging="360"/>
+      </w:pPr>
+    </w:lvl>
+    <w:lvl w:ilvl="8" w:tplc="0409001B" w:tentative="1">
+      <w:start w:val="1"/>
+      <w:numFmt w:val="lowerRoman"/>
+      <w:lvlText w:val="%9."/>
+      <w:lvlJc w:val="right"/>
+      <w:pPr>
+        <w:ind w:left="6480" w:hanging="180"/>
+      </w:pPr>
+    </w:lvl>
+  </w:abstractNum>
+  <w:abstractNum w:abstractNumId="14" w15:restartNumberingAfterBreak="0">
     <w:nsid w:val="661176FE"/>
     <w:multiLevelType w:val="multilevel"/>
     <w:tmpl w:val="0AC475E4"/>
@@ -16505,22 +16997,34 @@
     <w:abstractNumId w:val="5"/>
   </w:num>
   <w:num w:numId="11" w16cid:durableId="1131289035">
-    <w:abstractNumId w:val="10"/>
+    <w:abstractNumId w:val="14"/>
   </w:num>
   <w:num w:numId="12" w16cid:durableId="1564485834">
     <w:abstractNumId w:val="4"/>
   </w:num>
   <w:num w:numId="13" w16cid:durableId="1697733553">
-    <w:abstractNumId w:val="7"/>
+    <w:abstractNumId w:val="9"/>
   </w:num>
   <w:num w:numId="14" w16cid:durableId="877165776">
     <w:abstractNumId w:val="6"/>
   </w:num>
   <w:num w:numId="15" w16cid:durableId="2031448136">
+    <w:abstractNumId w:val="10"/>
+  </w:num>
+  <w:num w:numId="16" w16cid:durableId="1458911072">
+    <w:abstractNumId w:val="12"/>
+  </w:num>
+  <w:num w:numId="17" w16cid:durableId="1409302301">
+    <w:abstractNumId w:val="11"/>
+  </w:num>
+  <w:num w:numId="18" w16cid:durableId="1595629378">
     <w:abstractNumId w:val="8"/>
   </w:num>
-  <w:num w:numId="16" w16cid:durableId="1458911072">
-    <w:abstractNumId w:val="9"/>
+  <w:num w:numId="19" w16cid:durableId="563763382">
+    <w:abstractNumId w:val="13"/>
+  </w:num>
+  <w:num w:numId="20" w16cid:durableId="335419777">
+    <w:abstractNumId w:val="7"/>
   </w:num>
 </w:numbering>
 </file>
@@ -16825,11 +17329,10 @@
     <w:basedOn w:val="Normal"/>
     <w:next w:val="BodyText"/>
     <w:link w:val="Heading2Char"/>
-    <w:autoRedefine/>
     <w:uiPriority w:val="9"/>
     <w:unhideWhenUsed/>
     <w:qFormat/>
-    <w:rsid w:val="00B266E6"/>
+    <w:rsid w:val="00882A64"/>
     <w:pPr>
       <w:keepNext/>
       <w:keepLines/>
@@ -16848,22 +17351,18 @@
     <w:basedOn w:val="Normal"/>
     <w:next w:val="BodyText"/>
     <w:link w:val="Heading3Char"/>
-    <w:autoRedefine/>
     <w:uiPriority w:val="9"/>
     <w:unhideWhenUsed/>
     <w:qFormat/>
-    <w:rsid w:val="00070A2B"/>
+    <w:rsid w:val="00882A64"/>
     <w:pPr>
       <w:keepNext/>
       <w:keepLines/>
-      <w:numPr>
-        <w:numId w:val="16"/>
-      </w:numPr>
       <w:spacing w:before="240" w:after="240"/>
       <w:outlineLvl w:val="2"/>
     </w:pPr>
     <w:rPr>
-      <w:rFonts w:ascii="Arial Rounded MT Bold" w:eastAsiaTheme="majorEastAsia" w:hAnsi="Arial Rounded MT Bold" w:cstheme="majorBidi"/>
+      <w:rFonts w:ascii="Arial Rounded MT Bold" w:eastAsiaTheme="majorEastAsia" w:hAnsi="Arial Rounded MT Bold" w:cs="Times New Roman (Headings CS)"/>
       <w:color w:val="2463ED"/>
       <w:szCs w:val="28"/>
     </w:rPr>
@@ -16876,11 +17375,11 @@
     <w:uiPriority w:val="9"/>
     <w:unhideWhenUsed/>
     <w:qFormat/>
-    <w:rsid w:val="00070A2B"/>
+    <w:rsid w:val="00882A64"/>
     <w:pPr>
       <w:keepNext/>
       <w:keepLines/>
-      <w:spacing w:before="240" w:after="120"/>
+      <w:spacing w:before="240" w:after="240"/>
       <w:outlineLvl w:val="3"/>
     </w:pPr>
     <w:rPr>
@@ -17047,11 +17546,15 @@
     <w:name w:val="Compact"/>
     <w:basedOn w:val="BodyText"/>
     <w:qFormat/>
-    <w:rsid w:val="00B7769D"/>
+    <w:rsid w:val="00937974"/>
     <w:pPr>
       <w:adjustRightInd w:val="0"/>
-      <w:spacing w:before="36" w:after="36"/>
+      <w:spacing w:before="0" w:after="0"/>
     </w:pPr>
+    <w:rPr>
+      <w:rFonts w:ascii="Aptos Narrow" w:hAnsi="Aptos Narrow"/>
+      <w:sz w:val="18"/>
+    </w:rPr>
   </w:style>
   <w:style w:type="paragraph" w:styleId="Title">
     <w:name w:val="Title"/>
@@ -17127,17 +17630,16 @@
     <w:basedOn w:val="Title"/>
     <w:next w:val="BodyText"/>
     <w:qFormat/>
-    <w:rsid w:val="00181A74"/>
+    <w:rsid w:val="00882A64"/>
     <w:pPr>
       <w:keepNext/>
       <w:keepLines/>
-      <w:jc w:val="right"/>
     </w:pPr>
     <w:rPr>
       <w:rFonts w:ascii="Aptos Narrow" w:hAnsi="Aptos Narrow"/>
       <w:i/>
       <w:color w:val="auto"/>
-      <w:sz w:val="22"/>
+      <w:sz w:val="21"/>
       <w:szCs w:val="24"/>
     </w:rPr>
   </w:style>
@@ -17146,11 +17648,10 @@
     <w:basedOn w:val="Title"/>
     <w:next w:val="BodyText"/>
     <w:qFormat/>
-    <w:rsid w:val="00181A74"/>
+    <w:rsid w:val="00882A64"/>
     <w:pPr>
       <w:keepNext/>
       <w:keepLines/>
-      <w:jc w:val="right"/>
     </w:pPr>
     <w:rPr>
       <w:rFonts w:ascii="Aptos Narrow" w:hAnsi="Aptos Narrow"/>
@@ -17215,7 +17716,7 @@
     <w:basedOn w:val="DefaultParagraphFont"/>
     <w:link w:val="Heading2"/>
     <w:uiPriority w:val="9"/>
-    <w:rsid w:val="00B266E6"/>
+    <w:rsid w:val="00882A64"/>
     <w:rPr>
       <w:rFonts w:ascii="Arial Rounded MT Bold" w:eastAsiaTheme="majorEastAsia" w:hAnsi="Arial Rounded MT Bold" w:cstheme="majorBidi"/>
       <w:color w:val="2463ED"/>
@@ -17228,9 +17729,9 @@
     <w:basedOn w:val="DefaultParagraphFont"/>
     <w:link w:val="Heading3"/>
     <w:uiPriority w:val="9"/>
-    <w:rsid w:val="00070A2B"/>
+    <w:rsid w:val="00882A64"/>
     <w:rPr>
-      <w:rFonts w:ascii="Arial Rounded MT Bold" w:eastAsiaTheme="majorEastAsia" w:hAnsi="Arial Rounded MT Bold" w:cstheme="majorBidi"/>
+      <w:rFonts w:ascii="Arial Rounded MT Bold" w:eastAsiaTheme="majorEastAsia" w:hAnsi="Arial Rounded MT Bold" w:cs="Times New Roman (Headings CS)"/>
       <w:color w:val="2463ED"/>
       <w:sz w:val="22"/>
       <w:szCs w:val="28"/>
@@ -17241,7 +17742,7 @@
     <w:basedOn w:val="DefaultParagraphFont"/>
     <w:link w:val="Heading4"/>
     <w:uiPriority w:val="9"/>
-    <w:rsid w:val="00070A2B"/>
+    <w:rsid w:val="00882A64"/>
     <w:rPr>
       <w:rFonts w:ascii="Arial Rounded MT Bold" w:eastAsiaTheme="majorEastAsia" w:hAnsi="Arial Rounded MT Bold" w:cstheme="majorBidi"/>
       <w:iCs/>
@@ -17432,10 +17933,10 @@
     <w:name w:val="Verbatim Char"/>
     <w:basedOn w:val="CaptionChar"/>
     <w:link w:val="SourceCode"/>
-    <w:rsid w:val="000D7B29"/>
+    <w:rsid w:val="0020096B"/>
     <w:rPr>
-      <w:rFonts w:ascii="Consolas" w:hAnsi="Consolas"/>
-      <w:sz w:val="16"/>
+      <w:rFonts w:ascii="Consolas" w:hAnsi="Consolas" w:cs="Times New Roman (Body CS)"/>
+      <w:sz w:val="15"/>
       <w:shd w:val="clear" w:color="auto" w:fill="F2F2F2" w:themeFill="background1" w:themeFillShade="F2"/>
     </w:rPr>
   </w:style>
@@ -17479,24 +17980,23 @@
     <w:name w:val="Source Code"/>
     <w:basedOn w:val="Normal"/>
     <w:link w:val="VerbatimChar"/>
-    <w:autoRedefine/>
     <w:qFormat/>
-    <w:rsid w:val="000D7B29"/>
+    <w:rsid w:val="0020096B"/>
     <w:pPr>
       <w:shd w:val="clear" w:color="auto" w:fill="F2F2F2" w:themeFill="background1" w:themeFillShade="F2"/>
       <w:wordWrap w:val="0"/>
       <w:spacing w:before="360" w:after="360"/>
     </w:pPr>
     <w:rPr>
-      <w:rFonts w:ascii="Consolas" w:hAnsi="Consolas"/>
-      <w:sz w:val="16"/>
+      <w:rFonts w:ascii="Consolas" w:hAnsi="Consolas" w:cs="Times New Roman (Body CS)"/>
+      <w:sz w:val="15"/>
     </w:rPr>
   </w:style>
   <w:style w:type="character" w:customStyle="1" w:styleId="KeywordTok">
     <w:name w:val="KeywordTok"/>
     <w:basedOn w:val="VerbatimChar"/>
     <w:rPr>
-      <w:rFonts w:ascii="Consolas" w:hAnsi="Consolas"/>
+      <w:rFonts w:ascii="Consolas" w:hAnsi="Consolas" w:cs="Times New Roman (Body CS)"/>
       <w:color w:val="A626A4"/>
       <w:sz w:val="20"/>
       <w:shd w:val="clear" w:color="auto" w:fill="F2F2F2" w:themeFill="background1" w:themeFillShade="F2"/>
@@ -17506,7 +18006,7 @@
     <w:name w:val="DataTypeTok"/>
     <w:basedOn w:val="VerbatimChar"/>
     <w:rPr>
-      <w:rFonts w:ascii="Consolas" w:hAnsi="Consolas"/>
+      <w:rFonts w:ascii="Consolas" w:hAnsi="Consolas" w:cs="Times New Roman (Body CS)"/>
       <w:color w:val="A626A4"/>
       <w:sz w:val="20"/>
       <w:shd w:val="clear" w:color="auto" w:fill="F2F2F2" w:themeFill="background1" w:themeFillShade="F2"/>
@@ -17516,7 +18016,7 @@
     <w:name w:val="DecValTok"/>
     <w:basedOn w:val="VerbatimChar"/>
     <w:rPr>
-      <w:rFonts w:ascii="Consolas" w:hAnsi="Consolas"/>
+      <w:rFonts w:ascii="Consolas" w:hAnsi="Consolas" w:cs="Times New Roman (Body CS)"/>
       <w:color w:val="986801"/>
       <w:sz w:val="20"/>
       <w:shd w:val="clear" w:color="auto" w:fill="F2F2F2" w:themeFill="background1" w:themeFillShade="F2"/>
@@ -17526,7 +18026,7 @@
     <w:name w:val="BaseNTok"/>
     <w:basedOn w:val="VerbatimChar"/>
     <w:rPr>
-      <w:rFonts w:ascii="Consolas" w:hAnsi="Consolas"/>
+      <w:rFonts w:ascii="Consolas" w:hAnsi="Consolas" w:cs="Times New Roman (Body CS)"/>
       <w:color w:val="986801"/>
       <w:sz w:val="20"/>
       <w:shd w:val="clear" w:color="auto" w:fill="F2F2F2" w:themeFill="background1" w:themeFillShade="F2"/>
@@ -17536,7 +18036,7 @@
     <w:name w:val="FloatTok"/>
     <w:basedOn w:val="VerbatimChar"/>
     <w:rPr>
-      <w:rFonts w:ascii="Consolas" w:hAnsi="Consolas"/>
+      <w:rFonts w:ascii="Consolas" w:hAnsi="Consolas" w:cs="Times New Roman (Body CS)"/>
       <w:color w:val="986801"/>
       <w:sz w:val="20"/>
       <w:shd w:val="clear" w:color="auto" w:fill="F2F2F2" w:themeFill="background1" w:themeFillShade="F2"/>
@@ -17546,11 +18046,11 @@
     <w:name w:val="ConstantTok"/>
     <w:basedOn w:val="VerbatimChar"/>
     <w:qFormat/>
-    <w:rsid w:val="00A950FA"/>
+    <w:rsid w:val="00882A64"/>
     <w:rPr>
-      <w:rFonts w:ascii="Consolas" w:hAnsi="Consolas"/>
+      <w:rFonts w:ascii="Consolas" w:hAnsi="Consolas" w:cs="Times New Roman (Body CS)"/>
       <w:color w:val="986801"/>
-      <w:sz w:val="18"/>
+      <w:sz w:val="15"/>
       <w:shd w:val="clear" w:color="auto" w:fill="F2F2F2" w:themeFill="background1" w:themeFillShade="F2"/>
     </w:rPr>
   </w:style>
@@ -17558,7 +18058,7 @@
     <w:name w:val="CharTok"/>
     <w:basedOn w:val="VerbatimChar"/>
     <w:rPr>
-      <w:rFonts w:ascii="Consolas" w:hAnsi="Consolas"/>
+      <w:rFonts w:ascii="Consolas" w:hAnsi="Consolas" w:cs="Times New Roman (Body CS)"/>
       <w:color w:val="50A14F"/>
       <w:sz w:val="20"/>
       <w:shd w:val="clear" w:color="auto" w:fill="F2F2F2" w:themeFill="background1" w:themeFillShade="F2"/>
@@ -17568,11 +18068,11 @@
     <w:name w:val="SpecialCharTok"/>
     <w:basedOn w:val="VerbatimChar"/>
     <w:qFormat/>
-    <w:rsid w:val="00A950FA"/>
+    <w:rsid w:val="00873E9F"/>
     <w:rPr>
-      <w:rFonts w:ascii="Consolas" w:hAnsi="Consolas"/>
+      <w:rFonts w:ascii="Consolas" w:hAnsi="Consolas" w:cs="Times New Roman (Body CS)"/>
       <w:color w:val="0184BC"/>
-      <w:sz w:val="18"/>
+      <w:sz w:val="15"/>
       <w:shd w:val="clear" w:color="auto" w:fill="F2F2F2" w:themeFill="background1" w:themeFillShade="F2"/>
     </w:rPr>
   </w:style>
@@ -17580,11 +18080,11 @@
     <w:name w:val="StringTok"/>
     <w:basedOn w:val="VerbatimChar"/>
     <w:qFormat/>
-    <w:rsid w:val="00A950FA"/>
+    <w:rsid w:val="00882A64"/>
     <w:rPr>
-      <w:rFonts w:ascii="Consolas" w:hAnsi="Consolas"/>
+      <w:rFonts w:ascii="Consolas" w:hAnsi="Consolas" w:cs="Times New Roman (Body CS)"/>
       <w:color w:val="50A14F"/>
-      <w:sz w:val="18"/>
+      <w:sz w:val="15"/>
       <w:shd w:val="clear" w:color="auto" w:fill="F2F2F2" w:themeFill="background1" w:themeFillShade="F2"/>
     </w:rPr>
   </w:style>
@@ -17592,7 +18092,7 @@
     <w:name w:val="VerbatimStringTok"/>
     <w:basedOn w:val="VerbatimChar"/>
     <w:rPr>
-      <w:rFonts w:ascii="Consolas" w:hAnsi="Consolas"/>
+      <w:rFonts w:ascii="Consolas" w:hAnsi="Consolas" w:cs="Times New Roman (Body CS)"/>
       <w:color w:val="DA4453"/>
       <w:sz w:val="20"/>
       <w:shd w:val="clear" w:color="auto" w:fill="F2F2F2" w:themeFill="background1" w:themeFillShade="F2"/>
@@ -17602,7 +18102,7 @@
     <w:name w:val="SpecialStringTok"/>
     <w:basedOn w:val="VerbatimChar"/>
     <w:rPr>
-      <w:rFonts w:ascii="Consolas" w:hAnsi="Consolas"/>
+      <w:rFonts w:ascii="Consolas" w:hAnsi="Consolas" w:cs="Times New Roman (Body CS)"/>
       <w:color w:val="DA4453"/>
       <w:sz w:val="20"/>
       <w:shd w:val="clear" w:color="auto" w:fill="F2F2F2" w:themeFill="background1" w:themeFillShade="F2"/>
@@ -17612,7 +18112,7 @@
     <w:name w:val="ImportTok"/>
     <w:basedOn w:val="VerbatimChar"/>
     <w:rPr>
-      <w:rFonts w:ascii="Consolas" w:hAnsi="Consolas"/>
+      <w:rFonts w:ascii="Consolas" w:hAnsi="Consolas" w:cs="Times New Roman (Body CS)"/>
       <w:color w:val="50A14F"/>
       <w:sz w:val="20"/>
       <w:shd w:val="clear" w:color="auto" w:fill="F2F2F2" w:themeFill="background1" w:themeFillShade="F2"/>
@@ -17622,12 +18122,12 @@
     <w:name w:val="CommentTok"/>
     <w:basedOn w:val="VerbatimChar"/>
     <w:qFormat/>
-    <w:rsid w:val="00A950FA"/>
+    <w:rsid w:val="00882A64"/>
     <w:rPr>
-      <w:rFonts w:ascii="Consolas" w:hAnsi="Consolas"/>
+      <w:rFonts w:ascii="Consolas" w:hAnsi="Consolas" w:cs="Times New Roman (Body CS)"/>
       <w:i/>
       <w:color w:val="A0A1A7"/>
-      <w:sz w:val="18"/>
+      <w:sz w:val="15"/>
       <w:shd w:val="clear" w:color="auto" w:fill="F2F2F2" w:themeFill="background1" w:themeFillShade="F2"/>
     </w:rPr>
   </w:style>
@@ -17635,7 +18135,7 @@
     <w:name w:val="DocumentationTok"/>
     <w:basedOn w:val="VerbatimChar"/>
     <w:rPr>
-      <w:rFonts w:ascii="Consolas" w:hAnsi="Consolas"/>
+      <w:rFonts w:ascii="Consolas" w:hAnsi="Consolas" w:cs="Times New Roman (Body CS)"/>
       <w:color w:val="E45649"/>
       <w:sz w:val="20"/>
       <w:shd w:val="clear" w:color="auto" w:fill="F2F2F2" w:themeFill="background1" w:themeFillShade="F2"/>
@@ -17645,7 +18145,7 @@
     <w:name w:val="AnnotationTok"/>
     <w:basedOn w:val="VerbatimChar"/>
     <w:rPr>
-      <w:rFonts w:ascii="Consolas" w:hAnsi="Consolas"/>
+      <w:rFonts w:ascii="Consolas" w:hAnsi="Consolas" w:cs="Times New Roman (Body CS)"/>
       <w:color w:val="50A14F"/>
       <w:sz w:val="20"/>
       <w:shd w:val="clear" w:color="auto" w:fill="F2F2F2" w:themeFill="background1" w:themeFillShade="F2"/>
@@ -17655,7 +18155,7 @@
     <w:name w:val="CommentVarTok"/>
     <w:basedOn w:val="VerbatimChar"/>
     <w:rPr>
-      <w:rFonts w:ascii="Consolas" w:hAnsi="Consolas"/>
+      <w:rFonts w:ascii="Consolas" w:hAnsi="Consolas" w:cs="Times New Roman (Body CS)"/>
       <w:i/>
       <w:color w:val="E45649"/>
       <w:sz w:val="20"/>
@@ -17666,7 +18166,7 @@
     <w:name w:val="OtherTok"/>
     <w:basedOn w:val="VerbatimChar"/>
     <w:rPr>
-      <w:rFonts w:ascii="Consolas" w:hAnsi="Consolas"/>
+      <w:rFonts w:ascii="Consolas" w:hAnsi="Consolas" w:cs="Times New Roman (Body CS)"/>
       <w:color w:val="27AE60"/>
       <w:sz w:val="20"/>
       <w:shd w:val="clear" w:color="auto" w:fill="F2F2F2" w:themeFill="background1" w:themeFillShade="F2"/>
@@ -17676,11 +18176,11 @@
     <w:name w:val="FunctionTok"/>
     <w:basedOn w:val="VerbatimChar"/>
     <w:qFormat/>
-    <w:rsid w:val="00A950FA"/>
+    <w:rsid w:val="00882A64"/>
     <w:rPr>
-      <w:rFonts w:ascii="Consolas" w:hAnsi="Consolas"/>
+      <w:rFonts w:ascii="Consolas" w:hAnsi="Consolas" w:cs="Times New Roman (Body CS)"/>
       <w:color w:val="4078F2"/>
-      <w:sz w:val="18"/>
+      <w:sz w:val="15"/>
       <w:shd w:val="clear" w:color="auto" w:fill="F2F2F2" w:themeFill="background1" w:themeFillShade="F2"/>
     </w:rPr>
   </w:style>
@@ -17688,7 +18188,7 @@
     <w:name w:val="VariableTok"/>
     <w:basedOn w:val="VerbatimChar"/>
     <w:rPr>
-      <w:rFonts w:ascii="Consolas" w:hAnsi="Consolas"/>
+      <w:rFonts w:ascii="Consolas" w:hAnsi="Consolas" w:cs="Times New Roman (Body CS)"/>
       <w:color w:val="E45649"/>
       <w:sz w:val="20"/>
       <w:shd w:val="clear" w:color="auto" w:fill="F2F2F2" w:themeFill="background1" w:themeFillShade="F2"/>
@@ -17698,7 +18198,7 @@
     <w:name w:val="ControlFlowTok"/>
     <w:basedOn w:val="VerbatimChar"/>
     <w:rPr>
-      <w:rFonts w:ascii="Consolas" w:hAnsi="Consolas"/>
+      <w:rFonts w:ascii="Consolas" w:hAnsi="Consolas" w:cs="Times New Roman (Body CS)"/>
       <w:color w:val="A626A4"/>
       <w:sz w:val="20"/>
       <w:shd w:val="clear" w:color="auto" w:fill="F2F2F2" w:themeFill="background1" w:themeFillShade="F2"/>
@@ -17708,7 +18208,7 @@
     <w:name w:val="OperatorTok"/>
     <w:basedOn w:val="VerbatimChar"/>
     <w:rPr>
-      <w:rFonts w:ascii="Consolas" w:hAnsi="Consolas"/>
+      <w:rFonts w:ascii="Consolas" w:hAnsi="Consolas" w:cs="Times New Roman (Body CS)"/>
       <w:color w:val="A626A4"/>
       <w:sz w:val="20"/>
       <w:shd w:val="clear" w:color="auto" w:fill="F2F2F2" w:themeFill="background1" w:themeFillShade="F2"/>
@@ -17718,7 +18218,7 @@
     <w:name w:val="BuiltInTok"/>
     <w:basedOn w:val="VerbatimChar"/>
     <w:rPr>
-      <w:rFonts w:ascii="Consolas" w:hAnsi="Consolas"/>
+      <w:rFonts w:ascii="Consolas" w:hAnsi="Consolas" w:cs="Times New Roman (Body CS)"/>
       <w:color w:val="A626A4"/>
       <w:sz w:val="20"/>
       <w:shd w:val="clear" w:color="auto" w:fill="F2F2F2" w:themeFill="background1" w:themeFillShade="F2"/>
@@ -17728,7 +18228,7 @@
     <w:name w:val="ExtensionTok"/>
     <w:basedOn w:val="VerbatimChar"/>
     <w:rPr>
-      <w:rFonts w:ascii="Consolas" w:hAnsi="Consolas"/>
+      <w:rFonts w:ascii="Consolas" w:hAnsi="Consolas" w:cs="Times New Roman (Body CS)"/>
       <w:b/>
       <w:color w:val="4078F2"/>
       <w:sz w:val="20"/>
@@ -17739,7 +18239,7 @@
     <w:name w:val="PreprocessorTok"/>
     <w:basedOn w:val="VerbatimChar"/>
     <w:rPr>
-      <w:rFonts w:ascii="Consolas" w:hAnsi="Consolas"/>
+      <w:rFonts w:ascii="Consolas" w:hAnsi="Consolas" w:cs="Times New Roman (Body CS)"/>
       <w:color w:val="A626A4"/>
       <w:sz w:val="20"/>
       <w:shd w:val="clear" w:color="auto" w:fill="F2F2F2" w:themeFill="background1" w:themeFillShade="F2"/>
@@ -17749,11 +18249,11 @@
     <w:name w:val="AttributeTok"/>
     <w:basedOn w:val="VerbatimChar"/>
     <w:qFormat/>
-    <w:rsid w:val="00A950FA"/>
+    <w:rsid w:val="00882A64"/>
     <w:rPr>
-      <w:rFonts w:ascii="Consolas" w:hAnsi="Consolas"/>
+      <w:rFonts w:ascii="Consolas" w:hAnsi="Consolas" w:cs="Times New Roman (Body CS)"/>
       <w:color w:val="A626A4"/>
-      <w:sz w:val="18"/>
+      <w:sz w:val="15"/>
       <w:shd w:val="clear" w:color="auto" w:fill="F2F2F2" w:themeFill="background1" w:themeFillShade="F2"/>
     </w:rPr>
   </w:style>
@@ -17761,7 +18261,7 @@
     <w:name w:val="RegionMarkerTok"/>
     <w:basedOn w:val="VerbatimChar"/>
     <w:rPr>
-      <w:rFonts w:ascii="Consolas" w:hAnsi="Consolas"/>
+      <w:rFonts w:ascii="Consolas" w:hAnsi="Consolas" w:cs="Times New Roman (Body CS)"/>
       <w:color w:val="2980B9"/>
       <w:sz w:val="20"/>
       <w:shd w:val="clear" w:color="auto" w:fill="153042"/>
@@ -17771,7 +18271,7 @@
     <w:name w:val="InformationTok"/>
     <w:basedOn w:val="VerbatimChar"/>
     <w:rPr>
-      <w:rFonts w:ascii="Consolas" w:hAnsi="Consolas"/>
+      <w:rFonts w:ascii="Consolas" w:hAnsi="Consolas" w:cs="Times New Roman (Body CS)"/>
       <w:color w:val="C45B00"/>
       <w:sz w:val="20"/>
       <w:shd w:val="clear" w:color="auto" w:fill="F2F2F2" w:themeFill="background1" w:themeFillShade="F2"/>
@@ -17781,7 +18281,7 @@
     <w:name w:val="WarningTok"/>
     <w:basedOn w:val="VerbatimChar"/>
     <w:rPr>
-      <w:rFonts w:ascii="Consolas" w:hAnsi="Consolas"/>
+      <w:rFonts w:ascii="Consolas" w:hAnsi="Consolas" w:cs="Times New Roman (Body CS)"/>
       <w:color w:val="DA4453"/>
       <w:sz w:val="20"/>
       <w:shd w:val="clear" w:color="auto" w:fill="F2F2F2" w:themeFill="background1" w:themeFillShade="F2"/>
@@ -17791,7 +18291,7 @@
     <w:name w:val="AlertTok"/>
     <w:basedOn w:val="VerbatimChar"/>
     <w:rPr>
-      <w:rFonts w:ascii="Consolas" w:hAnsi="Consolas"/>
+      <w:rFonts w:ascii="Consolas" w:hAnsi="Consolas" w:cs="Times New Roman (Body CS)"/>
       <w:b/>
       <w:color w:val="95DA4C"/>
       <w:sz w:val="20"/>
@@ -17802,7 +18302,7 @@
     <w:name w:val="ErrorTok"/>
     <w:basedOn w:val="VerbatimChar"/>
     <w:rPr>
-      <w:rFonts w:ascii="Consolas" w:hAnsi="Consolas"/>
+      <w:rFonts w:ascii="Consolas" w:hAnsi="Consolas" w:cs="Times New Roman (Body CS)"/>
       <w:color w:val="F44747"/>
       <w:sz w:val="20"/>
       <w:shd w:val="clear" w:color="auto" w:fill="F2F2F2" w:themeFill="background1" w:themeFillShade="F2"/>
@@ -17812,11 +18312,11 @@
     <w:name w:val="NormalTok"/>
     <w:basedOn w:val="VerbatimChar"/>
     <w:qFormat/>
-    <w:rsid w:val="00A950FA"/>
+    <w:rsid w:val="00882A64"/>
     <w:rPr>
-      <w:rFonts w:ascii="Consolas" w:hAnsi="Consolas"/>
+      <w:rFonts w:ascii="Consolas" w:hAnsi="Consolas" w:cs="Times New Roman (Body CS)"/>
       <w:color w:val="383A42"/>
-      <w:sz w:val="18"/>
+      <w:sz w:val="15"/>
       <w:shd w:val="clear" w:color="auto" w:fill="F2F2F2" w:themeFill="background1" w:themeFillShade="F2"/>
     </w:rPr>
   </w:style>
@@ -17971,6 +18471,34 @@
     <w:name w:val="page number"/>
     <w:basedOn w:val="DefaultParagraphFont"/>
     <w:rsid w:val="003072E2"/>
+  </w:style>
+  <w:style w:type="numbering" w:customStyle="1" w:styleId="CurrentList6">
+    <w:name w:val="Current List6"/>
+    <w:uiPriority w:val="99"/>
+    <w:rsid w:val="00882A64"/>
+    <w:pPr>
+      <w:numPr>
+        <w:numId w:val="17"/>
+      </w:numPr>
+    </w:pPr>
+  </w:style>
+  <w:style w:type="table" w:styleId="TableGrid">
+    <w:name w:val="Table Grid"/>
+    <w:basedOn w:val="TableNormal"/>
+    <w:rsid w:val="00FC3593"/>
+    <w:pPr>
+      <w:spacing w:after="0"/>
+    </w:pPr>
+    <w:tblPr>
+      <w:tblBorders>
+        <w:top w:val="single" w:sz="4" w:space="0" w:color="auto"/>
+        <w:left w:val="single" w:sz="4" w:space="0" w:color="auto"/>
+        <w:bottom w:val="single" w:sz="4" w:space="0" w:color="auto"/>
+        <w:right w:val="single" w:sz="4" w:space="0" w:color="auto"/>
+        <w:insideH w:val="single" w:sz="4" w:space="0" w:color="auto"/>
+        <w:insideV w:val="single" w:sz="4" w:space="0" w:color="auto"/>
+      </w:tblBorders>
+    </w:tblPr>
   </w:style>
 </w:styles>
 </file>

</xml_diff>